<commit_message>
new commit by file
</commit_message>
<xml_diff>
--- a/TEMPLATES_DIRECTORY/Razpred.docx
+++ b/TEMPLATES_DIRECTORY/Razpred.docx
@@ -1,6 +1,6 @@
 
 <file path=word/document.xml><?xml version="1.0" encoding="utf-8"?>
-<w:document xmlns:wpc="http://schemas.microsoft.com/office/word/2010/wordprocessingCanvas" xmlns:mc="http://schemas.openxmlformats.org/markup-compatibility/2006" xmlns:o="urn:schemas-microsoft-com:office:office" xmlns:r="http://schemas.openxmlformats.org/officeDocument/2006/relationships" xmlns:m="http://schemas.openxmlformats.org/officeDocument/2006/math" xmlns:v="urn:schemas-microsoft-com:vml" xmlns:wp14="http://schemas.microsoft.com/office/word/2010/wordprocessingDrawing" xmlns:wp="http://schemas.openxmlformats.org/drawingml/2006/wordprocessingDrawing" xmlns:w10="urn:schemas-microsoft-com:office:word" xmlns:w="http://schemas.openxmlformats.org/wordprocessingml/2006/main" xmlns:w14="http://schemas.microsoft.com/office/word/2010/wordml" xmlns:wpg="http://schemas.microsoft.com/office/word/2010/wordprocessingGroup" xmlns:wpi="http://schemas.microsoft.com/office/word/2010/wordprocessingInk" xmlns:wne="http://schemas.microsoft.com/office/word/2006/wordml" xmlns:wps="http://schemas.microsoft.com/office/word/2010/wordprocessingShape" mc:Ignorable="w14 wp14">
+<w:document xmlns:ve="http://schemas.openxmlformats.org/markup-compatibility/2006" xmlns:o="urn:schemas-microsoft-com:office:office" xmlns:r="http://schemas.openxmlformats.org/officeDocument/2006/relationships" xmlns:m="http://schemas.openxmlformats.org/officeDocument/2006/math" xmlns:v="urn:schemas-microsoft-com:vml" xmlns:wp="http://schemas.openxmlformats.org/drawingml/2006/wordprocessingDrawing" xmlns:w10="urn:schemas-microsoft-com:office:word" xmlns:w="http://schemas.openxmlformats.org/wordprocessingml/2006/main" xmlns:wne="http://schemas.microsoft.com/office/word/2006/wordml">
   <w:body>
     <w:p>
       <w:pPr>
@@ -51,23 +51,27 @@
         <w:spacing w:before="0"/>
         <w:jc w:val="center"/>
         <w:rPr>
-          <w:rFonts w:ascii="Times New Roman" w:eastAsia="Times New Roman" w:hAnsi="Times New Roman" w:cs="Times New Roman"/>
+          <w:rFonts w:ascii="Times New Roman" w:hAnsi="Times New Roman" w:cs="Times New Roman"/>
           <w:b/>
+          <w:bCs/>
           <w:i w:val="0"/>
           <w:iCs w:val="0"/>
           <w:color w:val="auto"/>
           <w:sz w:val="24"/>
+          <w:szCs w:val="24"/>
           <w:lang w:val="bg-BG"/>
         </w:rPr>
       </w:pPr>
       <w:r>
         <w:rPr>
-          <w:rFonts w:ascii="Times New Roman" w:eastAsia="Times New Roman" w:hAnsi="Times New Roman" w:cs="Times New Roman"/>
+          <w:rFonts w:ascii="Times New Roman" w:hAnsi="Times New Roman" w:cs="Times New Roman"/>
           <w:b/>
+          <w:bCs/>
           <w:i w:val="0"/>
           <w:iCs w:val="0"/>
           <w:color w:val="auto"/>
           <w:sz w:val="24"/>
+          <w:szCs w:val="24"/>
           <w:lang w:val="bg-BG"/>
         </w:rPr>
         <w:t xml:space="preserve">РАЗПРЕДЕЛИТЕЛЕН ФОРМУЛЯР </w:t>
@@ -88,6 +92,7 @@
         <w:jc w:val="both"/>
         <w:rPr>
           <w:b/>
+          <w:bCs/>
           <w:sz w:val="24"/>
           <w:szCs w:val="24"/>
           <w:lang w:val="en-US"/>
@@ -119,7 +124,7 @@
       </w:r>
       <w:r>
         <w:rPr>
-          <w:color w:val="A6A6A6" w:themeColor="background1" w:themeShade="A6"/>
+          <w:color w:val="A6A6A6"/>
           <w:sz w:val="24"/>
           <w:szCs w:val="24"/>
           <w:lang w:val="ru-RU"/>
@@ -129,6 +134,7 @@
       <w:r>
         <w:rPr>
           <w:b/>
+          <w:bCs/>
           <w:sz w:val="24"/>
           <w:szCs w:val="24"/>
           <w:lang w:val="en-US"/>
@@ -142,6 +148,7 @@
         <w:ind w:firstLine="851"/>
         <w:rPr>
           <w:b/>
+          <w:bCs/>
           <w:sz w:val="24"/>
           <w:szCs w:val="24"/>
           <w:lang w:val="bg-BG"/>
@@ -157,7 +164,7 @@
       </w:r>
       <w:r>
         <w:rPr>
-          <w:color w:val="A6A6A6" w:themeColor="background1" w:themeShade="A6"/>
+          <w:color w:val="A6A6A6"/>
           <w:sz w:val="24"/>
           <w:szCs w:val="24"/>
           <w:lang w:val="bg-BG"/>
@@ -166,7 +173,7 @@
       </w:r>
       <w:r>
         <w:rPr>
-          <w:color w:val="A6A6A6" w:themeColor="background1" w:themeShade="A6"/>
+          <w:color w:val="A6A6A6"/>
           <w:sz w:val="24"/>
           <w:szCs w:val="24"/>
           <w:lang w:val="bg-BG"/>
@@ -176,6 +183,7 @@
       <w:r>
         <w:rPr>
           <w:b/>
+          <w:bCs/>
           <w:sz w:val="24"/>
           <w:szCs w:val="24"/>
           <w:lang w:val="en-US"/>
@@ -205,6 +213,7 @@
       <w:r>
         <w:rPr>
           <w:b/>
+          <w:bCs/>
           <w:sz w:val="24"/>
           <w:szCs w:val="24"/>
           <w:lang w:val="en-US"/>
@@ -354,28 +363,36 @@
     </w:p>
     <w:tbl>
       <w:tblPr>
-        <w:tblStyle w:val="TableWeb1"/>
         <w:tblW w:w="10845" w:type="dxa"/>
         <w:jc w:val="center"/>
+        <w:tblCellSpacing w:w="20" w:type="dxa"/>
+        <w:tblBorders>
+          <w:top w:val="outset" w:sz="6" w:space="0" w:color="auto"/>
+          <w:left w:val="outset" w:sz="6" w:space="0" w:color="auto"/>
+          <w:bottom w:val="outset" w:sz="6" w:space="0" w:color="auto"/>
+          <w:right w:val="outset" w:sz="6" w:space="0" w:color="auto"/>
+          <w:insideH w:val="outset" w:sz="6" w:space="0" w:color="auto"/>
+          <w:insideV w:val="outset" w:sz="6" w:space="0" w:color="auto"/>
+        </w:tblBorders>
         <w:tblLayout w:type="fixed"/>
-        <w:tblLook w:val="01E0" w:firstRow="1" w:lastRow="1" w:firstColumn="1" w:lastColumn="1" w:noHBand="0" w:noVBand="0"/>
+        <w:tblLook w:val="01E0"/>
       </w:tblPr>
       <w:tblGrid>
+        <w:gridCol w:w="1377"/>
+        <w:gridCol w:w="1600"/>
+        <w:gridCol w:w="2503"/>
+        <w:gridCol w:w="1799"/>
+        <w:gridCol w:w="1759"/>
         <w:gridCol w:w="1807"/>
-        <w:gridCol w:w="1808"/>
-        <w:gridCol w:w="1807"/>
-        <w:gridCol w:w="1808"/>
-        <w:gridCol w:w="1807"/>
-        <w:gridCol w:w="1808"/>
       </w:tblGrid>
       <w:tr>
         <w:trPr>
-          <w:cnfStyle w:val="100000000000" w:firstRow="1" w:lastRow="0" w:firstColumn="0" w:lastColumn="0" w:oddVBand="0" w:evenVBand="0" w:oddHBand="0" w:evenHBand="0" w:firstRowFirstColumn="0" w:firstRowLastColumn="0" w:lastRowFirstColumn="0" w:lastRowLastColumn="0"/>
+          <w:tblCellSpacing w:w="20" w:type="dxa"/>
           <w:jc w:val="center"/>
         </w:trPr>
         <w:tc>
           <w:tcPr>
-            <w:tcW w:w="1747" w:type="dxa"/>
+            <w:tcW w:w="1315" w:type="dxa"/>
             <w:tcBorders>
               <w:top w:val="outset" w:sz="12" w:space="0" w:color="auto"/>
               <w:left w:val="outset" w:sz="12" w:space="0" w:color="auto"/>
@@ -389,6 +406,7 @@
               <w:jc w:val="center"/>
               <w:rPr>
                 <w:b/>
+                <w:bCs/>
                 <w:sz w:val="24"/>
                 <w:szCs w:val="24"/>
                 <w:lang w:val="bg-BG"/>
@@ -397,6 +415,7 @@
             <w:r>
               <w:rPr>
                 <w:b/>
+                <w:bCs/>
                 <w:sz w:val="24"/>
                 <w:szCs w:val="24"/>
                 <w:lang w:val="bg-BG"/>
@@ -407,7 +426,7 @@
         </w:tc>
         <w:tc>
           <w:tcPr>
-            <w:tcW w:w="1768" w:type="dxa"/>
+            <w:tcW w:w="1559" w:type="dxa"/>
             <w:tcBorders>
               <w:top w:val="outset" w:sz="12" w:space="0" w:color="auto"/>
               <w:left w:val="outset" w:sz="12" w:space="0" w:color="auto"/>
@@ -422,6 +441,7 @@
               <w:jc w:val="center"/>
               <w:rPr>
                 <w:b/>
+                <w:bCs/>
                 <w:sz w:val="24"/>
                 <w:szCs w:val="24"/>
                 <w:lang w:val="bg-BG"/>
@@ -430,6 +450,7 @@
             <w:r>
               <w:rPr>
                 <w:b/>
+                <w:bCs/>
                 <w:sz w:val="24"/>
                 <w:szCs w:val="24"/>
                 <w:lang w:val="bg-BG"/>
@@ -440,7 +461,7 @@
         </w:tc>
         <w:tc>
           <w:tcPr>
-            <w:tcW w:w="1767" w:type="dxa"/>
+            <w:tcW w:w="2461" w:type="dxa"/>
             <w:tcBorders>
               <w:top w:val="outset" w:sz="12" w:space="0" w:color="auto"/>
               <w:left w:val="outset" w:sz="12" w:space="0" w:color="auto"/>
@@ -455,7 +476,9 @@
               <w:jc w:val="center"/>
               <w:rPr>
                 <w:b/>
+                <w:bCs/>
                 <w:i/>
+                <w:iCs/>
                 <w:color w:val="FF0000"/>
                 <w:sz w:val="24"/>
                 <w:szCs w:val="24"/>
@@ -465,17 +488,18 @@
             <w:r>
               <w:rPr>
                 <w:b/>
+                <w:bCs/>
                 <w:sz w:val="24"/>
                 <w:szCs w:val="24"/>
                 <w:lang w:val="bg-BG"/>
               </w:rPr>
-              <w:t>Изпитван показател</w:t>
+              <w:t>Изпитвана характеристика</w:t>
             </w:r>
           </w:p>
         </w:tc>
         <w:tc>
           <w:tcPr>
-            <w:tcW w:w="1768" w:type="dxa"/>
+            <w:tcW w:w="1758" w:type="dxa"/>
             <w:tcBorders>
               <w:top w:val="outset" w:sz="12" w:space="0" w:color="auto"/>
               <w:left w:val="outset" w:sz="12" w:space="0" w:color="auto"/>
@@ -490,6 +514,7 @@
               <w:jc w:val="center"/>
               <w:rPr>
                 <w:b/>
+                <w:bCs/>
                 <w:sz w:val="24"/>
                 <w:szCs w:val="24"/>
                 <w:lang w:val="bg-BG"/>
@@ -498,6 +523,7 @@
             <w:r>
               <w:rPr>
                 <w:b/>
+                <w:bCs/>
                 <w:sz w:val="24"/>
                 <w:szCs w:val="24"/>
                 <w:lang w:val="bg-BG"/>
@@ -508,7 +534,7 @@
         </w:tc>
         <w:tc>
           <w:tcPr>
-            <w:tcW w:w="1767" w:type="dxa"/>
+            <w:tcW w:w="1718" w:type="dxa"/>
             <w:tcBorders>
               <w:top w:val="outset" w:sz="12" w:space="0" w:color="auto"/>
               <w:left w:val="outset" w:sz="12" w:space="0" w:color="auto"/>
@@ -522,6 +548,7 @@
               <w:jc w:val="center"/>
               <w:rPr>
                 <w:b/>
+                <w:bCs/>
                 <w:sz w:val="22"/>
                 <w:szCs w:val="22"/>
                 <w:lang w:val="bg-BG"/>
@@ -530,62 +557,18 @@
             <w:r>
               <w:rPr>
                 <w:b/>
+                <w:bCs/>
                 <w:sz w:val="22"/>
                 <w:szCs w:val="22"/>
                 <w:lang w:val="bg-BG"/>
               </w:rPr>
-              <w:t>И</w:t>
-            </w:r>
-            <w:r>
-              <w:rPr>
-                <w:b/>
-                <w:sz w:val="22"/>
-                <w:szCs w:val="22"/>
-                <w:lang w:val="bg-BG"/>
-              </w:rPr>
-              <w:t xml:space="preserve">звършил </w:t>
-            </w:r>
-            <w:r>
-              <w:rPr>
-                <w:b/>
-                <w:sz w:val="22"/>
-                <w:szCs w:val="22"/>
-                <w:lang w:val="bg-BG"/>
-              </w:rPr>
-              <w:t>подготовката на пробата (д</w:t>
-            </w:r>
-            <w:r>
-              <w:rPr>
-                <w:b/>
-                <w:sz w:val="22"/>
-                <w:szCs w:val="22"/>
-                <w:lang w:val="bg-BG"/>
-              </w:rPr>
-              <w:t>ата и подпис</w:t>
-            </w:r>
-            <w:r>
-              <w:rPr>
-                <w:b/>
-                <w:sz w:val="22"/>
-                <w:szCs w:val="22"/>
-                <w:lang w:val="bg-BG"/>
-              </w:rPr>
-              <w:t>)</w:t>
-            </w:r>
-            <w:r>
-              <w:rPr>
-                <w:b/>
-                <w:sz w:val="22"/>
-                <w:szCs w:val="22"/>
-                <w:lang w:val="bg-BG"/>
-              </w:rPr>
-              <w:t xml:space="preserve"> </w:t>
+              <w:t xml:space="preserve">Извършил подготовката на пробата (дата и подпис) </w:t>
             </w:r>
           </w:p>
         </w:tc>
         <w:tc>
           <w:tcPr>
-            <w:tcW w:w="1748" w:type="dxa"/>
+            <w:tcW w:w="1746" w:type="dxa"/>
             <w:tcBorders>
               <w:top w:val="outset" w:sz="12" w:space="0" w:color="auto"/>
               <w:left w:val="outset" w:sz="12" w:space="0" w:color="auto"/>
@@ -600,6 +583,7 @@
               <w:jc w:val="center"/>
               <w:rPr>
                 <w:b/>
+                <w:bCs/>
                 <w:sz w:val="22"/>
                 <w:szCs w:val="22"/>
                 <w:lang w:val="bg-BG"/>
@@ -608,56 +592,12 @@
             <w:r>
               <w:rPr>
                 <w:b/>
+                <w:bCs/>
                 <w:sz w:val="22"/>
                 <w:szCs w:val="22"/>
                 <w:lang w:val="bg-BG"/>
               </w:rPr>
-              <w:t>И</w:t>
-            </w:r>
-            <w:r>
-              <w:rPr>
-                <w:b/>
-                <w:sz w:val="22"/>
-                <w:szCs w:val="22"/>
-                <w:lang w:val="bg-BG"/>
-              </w:rPr>
-              <w:t xml:space="preserve">звършил </w:t>
-            </w:r>
-            <w:r>
-              <w:rPr>
-                <w:b/>
-                <w:sz w:val="22"/>
-                <w:szCs w:val="22"/>
-                <w:lang w:val="bg-BG"/>
-              </w:rPr>
-              <w:t>измерването (д</w:t>
-            </w:r>
-            <w:r>
-              <w:rPr>
-                <w:b/>
-                <w:sz w:val="22"/>
-                <w:szCs w:val="22"/>
-                <w:lang w:val="bg-BG"/>
-              </w:rPr>
-              <w:t>ата и подпис</w:t>
-            </w:r>
-            <w:r>
-              <w:rPr>
-                <w:b/>
-                <w:sz w:val="22"/>
-                <w:szCs w:val="22"/>
-                <w:lang w:val="bg-BG"/>
-              </w:rPr>
-              <w:t>)</w:t>
-            </w:r>
-            <w:r>
-              <w:rPr>
-                <w:b/>
-                <w:sz w:val="22"/>
-                <w:szCs w:val="22"/>
-                <w:lang w:val="bg-BG"/>
-              </w:rPr>
-              <w:t xml:space="preserve"> </w:t>
+              <w:t xml:space="preserve">Извършил измерването (дата и подпис) </w:t>
             </w:r>
           </w:p>
         </w:tc>
@@ -665,11 +605,12 @@
       <w:tr>
         <w:trPr>
           <w:trHeight w:val="410"/>
+          <w:tblCellSpacing w:w="20" w:type="dxa"/>
           <w:jc w:val="center"/>
         </w:trPr>
         <w:tc>
           <w:tcPr>
-            <w:tcW w:w="1747" w:type="dxa"/>
+            <w:tcW w:w="1315" w:type="dxa"/>
             <w:vAlign w:val="center"/>
           </w:tcPr>
           <w:p>
@@ -678,6 +619,7 @@
               <w:jc w:val="center"/>
               <w:rPr>
                 <w:b/>
+                <w:bCs/>
                 <w:sz w:val="24"/>
                 <w:szCs w:val="24"/>
                 <w:lang w:val="en-US"/>
@@ -686,18 +628,18 @@
             <w:r>
               <w:rPr>
                 <w:b/>
+                <w:bCs/>
                 <w:sz w:val="24"/>
                 <w:szCs w:val="24"/>
                 <w:lang w:val="bg-BG"/>
               </w:rPr>
               <w:t>$$sample_code$$</w:t>
             </w:r>
-            <w:proofErr w:type="spellEnd"/>
           </w:p>
         </w:tc>
         <w:tc>
           <w:tcPr>
-            <w:tcW w:w="1768" w:type="dxa"/>
+            <w:tcW w:w="1559" w:type="dxa"/>
             <w:vAlign w:val="center"/>
           </w:tcPr>
           <w:p>
@@ -721,7 +663,7 @@
         </w:tc>
         <w:tc>
           <w:tcPr>
-            <w:tcW w:w="1767" w:type="dxa"/>
+            <w:tcW w:w="2461" w:type="dxa"/>
             <w:vAlign w:val="center"/>
           </w:tcPr>
           <w:p>
@@ -742,7 +684,6 @@
               </w:rPr>
               <w:t>$$num$$</w:t>
             </w:r>
-            <w:proofErr w:type="spellEnd"/>
             <w:r>
               <w:rPr>
                 <w:sz w:val="2"/>
@@ -759,12 +700,11 @@
               </w:rPr>
               <w:t>$$pokazat$$</w:t>
             </w:r>
-            <w:proofErr w:type="spellEnd"/>
           </w:p>
         </w:tc>
         <w:tc>
           <w:tcPr>
-            <w:tcW w:w="1768" w:type="dxa"/>
+            <w:tcW w:w="1758" w:type="dxa"/>
             <w:vAlign w:val="center"/>
           </w:tcPr>
           <w:p>
@@ -788,7 +728,7 @@
         </w:tc>
         <w:tc>
           <w:tcPr>
-            <w:tcW w:w="1767" w:type="dxa"/>
+            <w:tcW w:w="1718" w:type="dxa"/>
             <w:vAlign w:val="center"/>
           </w:tcPr>
           <w:p>
@@ -804,7 +744,7 @@
         </w:tc>
         <w:tc>
           <w:tcPr>
-            <w:tcW w:w="1748" w:type="dxa"/>
+            <w:tcW w:w="1746" w:type="dxa"/>
             <w:vAlign w:val="center"/>
           </w:tcPr>
           <w:p>
@@ -827,6 +767,7 @@
         <w:jc w:val="both"/>
         <w:rPr>
           <w:b w:val="0"/>
+          <w:bCs w:val="0"/>
           <w:sz w:val="22"/>
           <w:szCs w:val="22"/>
         </w:rPr>
@@ -839,114 +780,96 @@
         <w:jc w:val="both"/>
         <w:rPr>
           <w:b w:val="0"/>
-          <w:szCs w:val="24"/>
+          <w:bCs w:val="0"/>
         </w:rPr>
       </w:pPr>
       <w:r>
         <w:rPr>
           <w:b w:val="0"/>
-          <w:szCs w:val="24"/>
+          <w:bCs w:val="0"/>
         </w:rPr>
         <w:t>$$pp$$</w:t>
       </w:r>
-      <w:proofErr w:type="spellEnd"/>
       <w:r>
         <w:rPr>
           <w:b w:val="0"/>
-          <w:szCs w:val="24"/>
+          <w:bCs w:val="0"/>
         </w:rPr>
         <w:t xml:space="preserve"> </w:t>
       </w:r>
       <w:r>
         <w:rPr>
           <w:b w:val="0"/>
-          <w:szCs w:val="24"/>
+          <w:bCs w:val="0"/>
         </w:rPr>
         <w:t xml:space="preserve"> </w:t>
       </w:r>
       <w:r>
         <w:rPr>
           <w:b w:val="0"/>
-          <w:szCs w:val="24"/>
+          <w:bCs w:val="0"/>
         </w:rPr>
         <w:t>№</w:t>
       </w:r>
       <w:r>
         <w:rPr>
           <w:b w:val="0"/>
-          <w:szCs w:val="24"/>
+          <w:bCs w:val="0"/>
         </w:rPr>
         <w:t xml:space="preserve"> </w:t>
       </w:r>
       <w:r>
         <w:rPr>
           <w:b w:val="0"/>
-          <w:szCs w:val="24"/>
+          <w:bCs w:val="0"/>
         </w:rPr>
         <w:t>Р -</w:t>
       </w:r>
       <w:r>
         <w:rPr>
           <w:b w:val="0"/>
-          <w:szCs w:val="24"/>
+          <w:bCs w:val="0"/>
         </w:rPr>
         <w:t xml:space="preserve"> </w:t>
       </w:r>
       <w:r>
         <w:rPr>
           <w:b w:val="0"/>
-          <w:szCs w:val="24"/>
+          <w:bCs w:val="0"/>
         </w:rPr>
         <w:t>$$request_code$$</w:t>
       </w:r>
-      <w:proofErr w:type="spellEnd"/>
       <w:r>
         <w:rPr>
           <w:b w:val="0"/>
-          <w:szCs w:val="24"/>
+          <w:bCs w:val="0"/>
         </w:rPr>
         <w:t xml:space="preserve"> / </w:t>
       </w:r>
       <w:r>
         <w:rPr>
           <w:b w:val="0"/>
-          <w:szCs w:val="24"/>
+          <w:bCs w:val="0"/>
         </w:rPr>
         <w:t>$$request_date$$</w:t>
       </w:r>
       <w:r>
         <w:rPr>
           <w:b w:val="0"/>
-          <w:szCs w:val="24"/>
-        </w:rPr>
-        <w:t>г</w:t>
-      </w:r>
-      <w:proofErr w:type="spellEnd"/>
-      <w:r>
-        <w:rPr>
-          <w:b w:val="0"/>
-          <w:szCs w:val="24"/>
-        </w:rPr>
-        <w:t>.</w:t>
+          <w:bCs w:val="0"/>
+        </w:rPr>
+        <w:t>г.</w:t>
       </w:r>
     </w:p>
     <w:tbl>
       <w:tblPr>
-        <w:tblStyle w:val="TableGrid"/>
         <w:tblW w:w="0" w:type="auto"/>
-        <w:tblBorders>
-          <w:top w:val="none" w:sz="0" w:space="0" w:color="auto"/>
-          <w:left w:val="none" w:sz="0" w:space="0" w:color="auto"/>
-          <w:bottom w:val="none" w:sz="0" w:space="0" w:color="auto"/>
-          <w:right w:val="none" w:sz="0" w:space="0" w:color="auto"/>
-          <w:insideH w:val="none" w:sz="0" w:space="0" w:color="auto"/>
-          <w:insideV w:val="none" w:sz="0" w:space="0" w:color="auto"/>
-        </w:tblBorders>
-        <w:tblLook w:val="04A0" w:firstRow="1" w:lastRow="0" w:firstColumn="1" w:lastColumn="0" w:noHBand="0" w:noVBand="1"/>
+        <w:tblInd w:w="-106" w:type="dxa"/>
+        <w:tblLook w:val="00A0"/>
       </w:tblPr>
       <w:tblGrid>
         <w:gridCol w:w="4888"/>
-        <w:gridCol w:w="4888"/>
+        <w:gridCol w:w="5520"/>
       </w:tblGrid>
       <w:tr>
         <w:trPr>
@@ -976,7 +899,7 @@
         </w:tc>
         <w:tc>
           <w:tcPr>
-            <w:tcW w:w="4888" w:type="dxa"/>
+            <w:tcW w:w="5520" w:type="dxa"/>
           </w:tcPr>
           <w:p>
             <w:pPr>
@@ -1033,7 +956,7 @@
         </w:tc>
         <w:tc>
           <w:tcPr>
-            <w:tcW w:w="4888" w:type="dxa"/>
+            <w:tcW w:w="5520" w:type="dxa"/>
           </w:tcPr>
           <w:p>
             <w:pPr>
@@ -1050,23 +973,7 @@
                 <w:szCs w:val="24"/>
                 <w:lang w:val="ru-RU"/>
               </w:rPr>
-              <w:t>РГ</w:t>
-            </w:r>
-            <w:r>
-              <w:rPr>
-                <w:sz w:val="24"/>
-                <w:szCs w:val="24"/>
-                <w:lang w:val="ru-RU"/>
-              </w:rPr>
-              <w:t xml:space="preserve"> ИР: …………………</w:t>
-            </w:r>
-            <w:r>
-              <w:rPr>
-                <w:sz w:val="24"/>
-                <w:szCs w:val="24"/>
-                <w:lang w:val="ru-RU"/>
-              </w:rPr>
-              <w:t>…......</w:t>
+              <w:t>РГ ИР: ……………………......</w:t>
             </w:r>
           </w:p>
           <w:p>
@@ -1124,16 +1031,16 @@
       </w:r>
     </w:p>
     <w:sectPr>
-      <w:footerReference w:type="default" r:id="rId7"/>
-      <w:headerReference w:type="first" r:id="rId8"/>
-      <w:footerReference w:type="first" r:id="rId9"/>
+      <w:footerReference w:type="default" r:id="rId6"/>
+      <w:headerReference w:type="first" r:id="rId7"/>
+      <w:footerReference w:type="first" r:id="rId8"/>
       <w:footnotePr>
         <w:pos w:val="beneathText"/>
       </w:footnotePr>
       <w:type w:val="continuous"/>
       <w:pgSz w:w="11905" w:h="16837" w:code="9"/>
       <w:pgMar w:top="1021" w:right="565" w:bottom="1021" w:left="851" w:header="567" w:footer="567" w:gutter="0"/>
-      <w:cols w:space="720"/>
+      <w:cols w:space="708"/>
       <w:titlePg/>
       <w:docGrid w:linePitch="360"/>
     </w:sectPr>
@@ -1142,15 +1049,15 @@
 </file>
 
 <file path=word/endnotes.xml><?xml version="1.0" encoding="utf-8"?>
-<w:endnotes xmlns:wpc="http://schemas.microsoft.com/office/word/2010/wordprocessingCanvas" xmlns:mc="http://schemas.openxmlformats.org/markup-compatibility/2006" xmlns:o="urn:schemas-microsoft-com:office:office" xmlns:r="http://schemas.openxmlformats.org/officeDocument/2006/relationships" xmlns:m="http://schemas.openxmlformats.org/officeDocument/2006/math" xmlns:v="urn:schemas-microsoft-com:vml" xmlns:wp14="http://schemas.microsoft.com/office/word/2010/wordprocessingDrawing" xmlns:wp="http://schemas.openxmlformats.org/drawingml/2006/wordprocessingDrawing" xmlns:w10="urn:schemas-microsoft-com:office:word" xmlns:w="http://schemas.openxmlformats.org/wordprocessingml/2006/main" xmlns:w14="http://schemas.microsoft.com/office/word/2010/wordml" xmlns:wpg="http://schemas.microsoft.com/office/word/2010/wordprocessingGroup" xmlns:wpi="http://schemas.microsoft.com/office/word/2010/wordprocessingInk" xmlns:wne="http://schemas.microsoft.com/office/word/2006/wordml" xmlns:wps="http://schemas.microsoft.com/office/word/2010/wordprocessingShape" mc:Ignorable="w14 wp14">
-  <w:endnote w:type="separator" w:id="-1">
+<w:endnotes xmlns:ve="http://schemas.openxmlformats.org/markup-compatibility/2006" xmlns:o="urn:schemas-microsoft-com:office:office" xmlns:r="http://schemas.openxmlformats.org/officeDocument/2006/relationships" xmlns:m="http://schemas.openxmlformats.org/officeDocument/2006/math" xmlns:v="urn:schemas-microsoft-com:vml" xmlns:wp="http://schemas.openxmlformats.org/drawingml/2006/wordprocessingDrawing" xmlns:w10="urn:schemas-microsoft-com:office:word" xmlns:w="http://schemas.openxmlformats.org/wordprocessingml/2006/main" xmlns:wne="http://schemas.microsoft.com/office/word/2006/wordml">
+  <w:endnote w:type="separator" w:id="0">
     <w:p>
       <w:r>
         <w:separator/>
       </w:r>
     </w:p>
   </w:endnote>
-  <w:endnote w:type="continuationSeparator" w:id="0">
+  <w:endnote w:type="continuationSeparator" w:id="1">
     <w:p>
       <w:r>
         <w:continuationSeparator/>
@@ -1161,7 +1068,7 @@
 </file>
 
 <file path=word/footer1.xml><?xml version="1.0" encoding="utf-8"?>
-<w:ftr xmlns:wpc="http://schemas.microsoft.com/office/word/2010/wordprocessingCanvas" xmlns:mc="http://schemas.openxmlformats.org/markup-compatibility/2006" xmlns:o="urn:schemas-microsoft-com:office:office" xmlns:r="http://schemas.openxmlformats.org/officeDocument/2006/relationships" xmlns:m="http://schemas.openxmlformats.org/officeDocument/2006/math" xmlns:v="urn:schemas-microsoft-com:vml" xmlns:wp14="http://schemas.microsoft.com/office/word/2010/wordprocessingDrawing" xmlns:wp="http://schemas.openxmlformats.org/drawingml/2006/wordprocessingDrawing" xmlns:w10="urn:schemas-microsoft-com:office:word" xmlns:w="http://schemas.openxmlformats.org/wordprocessingml/2006/main" xmlns:w14="http://schemas.microsoft.com/office/word/2010/wordml" xmlns:wpg="http://schemas.microsoft.com/office/word/2010/wordprocessingGroup" xmlns:wpi="http://schemas.microsoft.com/office/word/2010/wordprocessingInk" xmlns:wne="http://schemas.microsoft.com/office/word/2006/wordml" xmlns:wps="http://schemas.microsoft.com/office/word/2010/wordprocessingShape" mc:Ignorable="w14 wp14">
+<w:ftr xmlns:ve="http://schemas.openxmlformats.org/markup-compatibility/2006" xmlns:o="urn:schemas-microsoft-com:office:office" xmlns:r="http://schemas.openxmlformats.org/officeDocument/2006/relationships" xmlns:m="http://schemas.openxmlformats.org/officeDocument/2006/math" xmlns:v="urn:schemas-microsoft-com:vml" xmlns:wp="http://schemas.openxmlformats.org/drawingml/2006/wordprocessingDrawing" xmlns:w10="urn:schemas-microsoft-com:office:word" xmlns:w="http://schemas.openxmlformats.org/wordprocessingml/2006/main" xmlns:wne="http://schemas.microsoft.com/office/word/2006/wordml">
   <w:p>
     <w:pPr>
       <w:jc w:val="right"/>
@@ -1279,7 +1186,7 @@
 </file>
 
 <file path=word/footer2.xml><?xml version="1.0" encoding="utf-8"?>
-<w:ftr xmlns:wpc="http://schemas.microsoft.com/office/word/2010/wordprocessingCanvas" xmlns:mc="http://schemas.openxmlformats.org/markup-compatibility/2006" xmlns:o="urn:schemas-microsoft-com:office:office" xmlns:r="http://schemas.openxmlformats.org/officeDocument/2006/relationships" xmlns:m="http://schemas.openxmlformats.org/officeDocument/2006/math" xmlns:v="urn:schemas-microsoft-com:vml" xmlns:wp14="http://schemas.microsoft.com/office/word/2010/wordprocessingDrawing" xmlns:wp="http://schemas.openxmlformats.org/drawingml/2006/wordprocessingDrawing" xmlns:w10="urn:schemas-microsoft-com:office:word" xmlns:w="http://schemas.openxmlformats.org/wordprocessingml/2006/main" xmlns:w14="http://schemas.microsoft.com/office/word/2010/wordml" xmlns:wpg="http://schemas.microsoft.com/office/word/2010/wordprocessingGroup" xmlns:wpi="http://schemas.microsoft.com/office/word/2010/wordprocessingInk" xmlns:wne="http://schemas.microsoft.com/office/word/2006/wordml" xmlns:wps="http://schemas.microsoft.com/office/word/2010/wordprocessingShape" mc:Ignorable="w14 wp14">
+<w:ftr xmlns:ve="http://schemas.openxmlformats.org/markup-compatibility/2006" xmlns:o="urn:schemas-microsoft-com:office:office" xmlns:r="http://schemas.openxmlformats.org/officeDocument/2006/relationships" xmlns:m="http://schemas.openxmlformats.org/officeDocument/2006/math" xmlns:v="urn:schemas-microsoft-com:vml" xmlns:wp="http://schemas.openxmlformats.org/drawingml/2006/wordprocessingDrawing" xmlns:w10="urn:schemas-microsoft-com:office:word" xmlns:w="http://schemas.openxmlformats.org/wordprocessingml/2006/main" xmlns:wne="http://schemas.microsoft.com/office/word/2006/wordml">
   <w:p>
     <w:pPr>
       <w:jc w:val="right"/>
@@ -1295,15 +1202,7 @@
         <w:szCs w:val="22"/>
         <w:lang w:val="bg-BG"/>
       </w:rPr>
-      <w:t>Стр.</w:t>
-    </w:r>
-    <w:r>
-      <w:rPr>
-        <w:sz w:val="22"/>
-        <w:szCs w:val="22"/>
-        <w:lang w:val="bg-BG"/>
-      </w:rPr>
-      <w:t xml:space="preserve"> </w:t>
+      <w:t xml:space="preserve">Стр. </w:t>
     </w:r>
     <w:r>
       <w:rPr>
@@ -1405,15 +1304,15 @@
 </file>
 
 <file path=word/footnotes.xml><?xml version="1.0" encoding="utf-8"?>
-<w:footnotes xmlns:wpc="http://schemas.microsoft.com/office/word/2010/wordprocessingCanvas" xmlns:mc="http://schemas.openxmlformats.org/markup-compatibility/2006" xmlns:o="urn:schemas-microsoft-com:office:office" xmlns:r="http://schemas.openxmlformats.org/officeDocument/2006/relationships" xmlns:m="http://schemas.openxmlformats.org/officeDocument/2006/math" xmlns:v="urn:schemas-microsoft-com:vml" xmlns:wp14="http://schemas.microsoft.com/office/word/2010/wordprocessingDrawing" xmlns:wp="http://schemas.openxmlformats.org/drawingml/2006/wordprocessingDrawing" xmlns:w10="urn:schemas-microsoft-com:office:word" xmlns:w="http://schemas.openxmlformats.org/wordprocessingml/2006/main" xmlns:w14="http://schemas.microsoft.com/office/word/2010/wordml" xmlns:wpg="http://schemas.microsoft.com/office/word/2010/wordprocessingGroup" xmlns:wpi="http://schemas.microsoft.com/office/word/2010/wordprocessingInk" xmlns:wne="http://schemas.microsoft.com/office/word/2006/wordml" xmlns:wps="http://schemas.microsoft.com/office/word/2010/wordprocessingShape" mc:Ignorable="w14 wp14">
-  <w:footnote w:type="separator" w:id="-1">
+<w:footnotes xmlns:ve="http://schemas.openxmlformats.org/markup-compatibility/2006" xmlns:o="urn:schemas-microsoft-com:office:office" xmlns:r="http://schemas.openxmlformats.org/officeDocument/2006/relationships" xmlns:m="http://schemas.openxmlformats.org/officeDocument/2006/math" xmlns:v="urn:schemas-microsoft-com:vml" xmlns:wp="http://schemas.openxmlformats.org/drawingml/2006/wordprocessingDrawing" xmlns:w10="urn:schemas-microsoft-com:office:word" xmlns:w="http://schemas.openxmlformats.org/wordprocessingml/2006/main" xmlns:wne="http://schemas.microsoft.com/office/word/2006/wordml">
+  <w:footnote w:type="separator" w:id="0">
     <w:p>
       <w:r>
         <w:separator/>
       </w:r>
     </w:p>
   </w:footnote>
-  <w:footnote w:type="continuationSeparator" w:id="0">
+  <w:footnote w:type="continuationSeparator" w:id="1">
     <w:p>
       <w:r>
         <w:continuationSeparator/>
@@ -1424,7 +1323,7 @@
 </file>
 
 <file path=word/header1.xml><?xml version="1.0" encoding="utf-8"?>
-<w:hdr xmlns:wpc="http://schemas.microsoft.com/office/word/2010/wordprocessingCanvas" xmlns:mc="http://schemas.openxmlformats.org/markup-compatibility/2006" xmlns:o="urn:schemas-microsoft-com:office:office" xmlns:r="http://schemas.openxmlformats.org/officeDocument/2006/relationships" xmlns:m="http://schemas.openxmlformats.org/officeDocument/2006/math" xmlns:v="urn:schemas-microsoft-com:vml" xmlns:wp14="http://schemas.microsoft.com/office/word/2010/wordprocessingDrawing" xmlns:wp="http://schemas.openxmlformats.org/drawingml/2006/wordprocessingDrawing" xmlns:w10="urn:schemas-microsoft-com:office:word" xmlns:w="http://schemas.openxmlformats.org/wordprocessingml/2006/main" xmlns:w14="http://schemas.microsoft.com/office/word/2010/wordml" xmlns:wpg="http://schemas.microsoft.com/office/word/2010/wordprocessingGroup" xmlns:wpi="http://schemas.microsoft.com/office/word/2010/wordprocessingInk" xmlns:wne="http://schemas.microsoft.com/office/word/2006/wordml" xmlns:wps="http://schemas.microsoft.com/office/word/2010/wordprocessingShape" mc:Ignorable="w14 wp14">
+<w:hdr xmlns:ve="http://schemas.openxmlformats.org/markup-compatibility/2006" xmlns:o="urn:schemas-microsoft-com:office:office" xmlns:r="http://schemas.openxmlformats.org/officeDocument/2006/relationships" xmlns:m="http://schemas.openxmlformats.org/officeDocument/2006/math" xmlns:v="urn:schemas-microsoft-com:vml" xmlns:wp="http://schemas.openxmlformats.org/drawingml/2006/wordprocessingDrawing" xmlns:w10="urn:schemas-microsoft-com:office:word" xmlns:w="http://schemas.openxmlformats.org/wordprocessingml/2006/main" xmlns:wne="http://schemas.microsoft.com/office/word/2006/wordml">
   <w:p>
     <w:pPr>
       <w:pStyle w:val="Heading2"/>
@@ -1447,6 +1346,7 @@
       <w:jc w:val="center"/>
       <w:rPr>
         <w:b/>
+        <w:bCs/>
         <w:sz w:val="24"/>
         <w:szCs w:val="24"/>
         <w:lang w:val="bg-BG"/>
@@ -1459,6 +1359,7 @@
       <w:jc w:val="center"/>
       <w:rPr>
         <w:b/>
+        <w:bCs/>
         <w:sz w:val="24"/>
         <w:szCs w:val="24"/>
         <w:lang w:val="bg-BG"/>
@@ -1471,6 +1372,7 @@
       <w:jc w:val="center"/>
       <w:rPr>
         <w:b/>
+        <w:bCs/>
         <w:sz w:val="24"/>
         <w:szCs w:val="24"/>
         <w:lang w:val="bg-BG"/>
@@ -1479,6 +1381,7 @@
     <w:r>
       <w:rPr>
         <w:b/>
+        <w:bCs/>
         <w:sz w:val="24"/>
         <w:szCs w:val="24"/>
         <w:lang w:val="bg-BG"/>
@@ -1492,6 +1395,7 @@
       <w:jc w:val="center"/>
       <w:rPr>
         <w:b/>
+        <w:bCs/>
         <w:sz w:val="24"/>
         <w:szCs w:val="24"/>
         <w:lang w:val="bg-BG"/>
@@ -1500,6 +1404,7 @@
     <w:r>
       <w:rPr>
         <w:b/>
+        <w:bCs/>
         <w:sz w:val="24"/>
         <w:szCs w:val="24"/>
         <w:lang w:val="en-US"/>
@@ -1509,6 +1414,7 @@
     <w:r>
       <w:rPr>
         <w:b/>
+        <w:bCs/>
         <w:sz w:val="24"/>
         <w:szCs w:val="24"/>
         <w:lang w:val="bg-BG"/>
@@ -1522,6 +1428,7 @@
       <w:jc w:val="center"/>
       <w:rPr>
         <w:b/>
+        <w:bCs/>
         <w:sz w:val="24"/>
         <w:szCs w:val="24"/>
         <w:lang w:val="bg-BG"/>
@@ -1530,6 +1437,7 @@
     <w:r>
       <w:rPr>
         <w:b/>
+        <w:bCs/>
         <w:sz w:val="24"/>
         <w:szCs w:val="24"/>
         <w:lang w:val="bg-BG"/>
@@ -1543,6 +1451,7 @@
       <w:jc w:val="center"/>
       <w:rPr>
         <w:b/>
+        <w:bCs/>
         <w:sz w:val="24"/>
         <w:szCs w:val="24"/>
         <w:lang w:val="bg-BG"/>
@@ -1551,6 +1460,7 @@
     <w:r>
       <w:rPr>
         <w:b/>
+        <w:bCs/>
         <w:sz w:val="24"/>
         <w:szCs w:val="24"/>
         <w:lang w:val="bg-BG"/>
@@ -1564,6 +1474,7 @@
       <w:jc w:val="center"/>
       <w:rPr>
         <w:b/>
+        <w:bCs/>
         <w:sz w:val="24"/>
         <w:szCs w:val="24"/>
         <w:lang w:val="it-IT"/>
@@ -1572,6 +1483,7 @@
     <w:r>
       <w:rPr>
         <w:b/>
+        <w:bCs/>
         <w:sz w:val="24"/>
         <w:szCs w:val="24"/>
         <w:lang w:val="bg-BG"/>
@@ -1581,6 +1493,7 @@
     <w:r>
       <w:rPr>
         <w:b/>
+        <w:bCs/>
         <w:sz w:val="24"/>
         <w:szCs w:val="24"/>
         <w:lang w:val="it-IT"/>
@@ -1590,6 +1503,7 @@
     <w:r>
       <w:rPr>
         <w:b/>
+        <w:bCs/>
         <w:sz w:val="24"/>
         <w:szCs w:val="24"/>
         <w:lang w:val="it-IT"/>
@@ -1606,31 +1520,27 @@
 </file>
 
 <file path=word/styles.xml><?xml version="1.0" encoding="utf-8"?>
-<w:styles xmlns:mc="http://schemas.openxmlformats.org/markup-compatibility/2006" xmlns:r="http://schemas.openxmlformats.org/officeDocument/2006/relationships" xmlns:w="http://schemas.openxmlformats.org/wordprocessingml/2006/main" xmlns:w14="http://schemas.microsoft.com/office/word/2010/wordml" mc:Ignorable="w14">
+<w:styles xmlns:r="http://schemas.openxmlformats.org/officeDocument/2006/relationships" xmlns:w="http://schemas.openxmlformats.org/wordprocessingml/2006/main">
   <w:docDefaults>
     <w:rPrDefault>
       <w:rPr>
-        <w:rFonts w:asciiTheme="minorHAnsi" w:eastAsiaTheme="minorHAnsi" w:hAnsiTheme="minorHAnsi" w:cstheme="minorBidi"/>
-        <w:sz w:val="22"/>
-        <w:szCs w:val="22"/>
-        <w:lang w:val="en-US" w:eastAsia="en-US" w:bidi="ar-SA"/>
+        <w:rFonts w:ascii="Calibri" w:eastAsia="Calibri" w:hAnsi="Calibri" w:cs="Times New Roman"/>
+        <w:sz w:val="22"/>
+        <w:szCs w:val="22"/>
+        <w:lang w:val="bg-BG" w:eastAsia="bg-BG" w:bidi="ar-SA"/>
       </w:rPr>
     </w:rPrDefault>
-    <w:pPrDefault>
-      <w:pPr>
-        <w:spacing w:after="200" w:line="276" w:lineRule="auto"/>
-      </w:pPr>
-    </w:pPrDefault>
+    <w:pPrDefault/>
   </w:docDefaults>
-  <w:latentStyles w:defLockedState="0" w:defUIPriority="99" w:defSemiHidden="1" w:defUnhideWhenUsed="1" w:defQFormat="0" w:count="267">
+  <w:latentStyles w:defLockedState="1" w:defUIPriority="99" w:defSemiHidden="1" w:defUnhideWhenUsed="1" w:defQFormat="0" w:count="267">
     <w:lsdException w:name="Normal" w:semiHidden="0" w:uiPriority="0" w:unhideWhenUsed="0" w:qFormat="1"/>
     <w:lsdException w:name="heading 1" w:semiHidden="0" w:uiPriority="9" w:unhideWhenUsed="0" w:qFormat="1"/>
-    <w:lsdException w:name="heading 2" w:uiPriority="0" w:qFormat="1"/>
+    <w:lsdException w:name="heading 2" w:semiHidden="0" w:uiPriority="9" w:unhideWhenUsed="0" w:qFormat="1"/>
     <w:lsdException w:name="heading 3" w:uiPriority="9" w:qFormat="1"/>
-    <w:lsdException w:name="heading 4" w:uiPriority="0" w:qFormat="1"/>
+    <w:lsdException w:name="heading 4" w:semiHidden="0" w:uiPriority="9" w:unhideWhenUsed="0" w:qFormat="1"/>
     <w:lsdException w:name="heading 5" w:uiPriority="9" w:qFormat="1"/>
     <w:lsdException w:name="heading 6" w:uiPriority="9" w:qFormat="1"/>
-    <w:lsdException w:name="heading 7" w:uiPriority="0" w:qFormat="1"/>
+    <w:lsdException w:name="heading 7" w:semiHidden="0" w:uiPriority="9" w:unhideWhenUsed="0" w:qFormat="1"/>
     <w:lsdException w:name="heading 8" w:uiPriority="9" w:qFormat="1"/>
     <w:lsdException w:name="heading 9" w:uiPriority="9" w:qFormat="1"/>
     <w:lsdException w:name="toc 1" w:uiPriority="39"/>
@@ -1642,130 +1552,124 @@
     <w:lsdException w:name="toc 7" w:uiPriority="39"/>
     <w:lsdException w:name="toc 8" w:uiPriority="39"/>
     <w:lsdException w:name="toc 9" w:uiPriority="39"/>
-    <w:lsdException w:name="header" w:uiPriority="0"/>
-    <w:lsdException w:name="footer" w:uiPriority="0"/>
     <w:lsdException w:name="caption" w:uiPriority="35" w:qFormat="1"/>
-    <w:lsdException w:name="page number" w:uiPriority="0"/>
-    <w:lsdException w:name="List" w:uiPriority="0"/>
-    <w:lsdException w:name="Title" w:semiHidden="0" w:uiPriority="0" w:unhideWhenUsed="0" w:qFormat="1"/>
+    <w:lsdException w:name="Title" w:semiHidden="0" w:uiPriority="10" w:unhideWhenUsed="0" w:qFormat="1"/>
     <w:lsdException w:name="Default Paragraph Font" w:uiPriority="1"/>
-    <w:lsdException w:name="Body Text" w:uiPriority="0"/>
-    <w:lsdException w:name="Subtitle" w:semiHidden="0" w:uiPriority="0" w:unhideWhenUsed="0" w:qFormat="1"/>
+    <w:lsdException w:name="Subtitle" w:semiHidden="0" w:uiPriority="11" w:unhideWhenUsed="0" w:qFormat="1"/>
     <w:lsdException w:name="Strong" w:semiHidden="0" w:uiPriority="22" w:unhideWhenUsed="0" w:qFormat="1"/>
     <w:lsdException w:name="Emphasis" w:semiHidden="0" w:uiPriority="20" w:unhideWhenUsed="0" w:qFormat="1"/>
-    <w:lsdException w:name="Table Web 1" w:uiPriority="0"/>
-    <w:lsdException w:name="Table Grid" w:semiHidden="0" w:uiPriority="0" w:unhideWhenUsed="0"/>
-    <w:lsdException w:name="Placeholder Text" w:unhideWhenUsed="0"/>
-    <w:lsdException w:name="No Spacing" w:semiHidden="0" w:uiPriority="1" w:unhideWhenUsed="0" w:qFormat="1"/>
-    <w:lsdException w:name="Light Shading" w:semiHidden="0" w:uiPriority="60" w:unhideWhenUsed="0"/>
-    <w:lsdException w:name="Light List" w:semiHidden="0" w:uiPriority="61" w:unhideWhenUsed="0"/>
-    <w:lsdException w:name="Light Grid" w:semiHidden="0" w:uiPriority="62" w:unhideWhenUsed="0"/>
-    <w:lsdException w:name="Medium Shading 1" w:semiHidden="0" w:uiPriority="63" w:unhideWhenUsed="0"/>
-    <w:lsdException w:name="Medium Shading 2" w:semiHidden="0" w:uiPriority="64" w:unhideWhenUsed="0"/>
-    <w:lsdException w:name="Medium List 1" w:semiHidden="0" w:uiPriority="65" w:unhideWhenUsed="0"/>
-    <w:lsdException w:name="Medium List 2" w:semiHidden="0" w:uiPriority="66" w:unhideWhenUsed="0"/>
-    <w:lsdException w:name="Medium Grid 1" w:semiHidden="0" w:uiPriority="67" w:unhideWhenUsed="0"/>
-    <w:lsdException w:name="Medium Grid 2" w:semiHidden="0" w:uiPriority="68" w:unhideWhenUsed="0"/>
-    <w:lsdException w:name="Medium Grid 3" w:semiHidden="0" w:uiPriority="69" w:unhideWhenUsed="0"/>
-    <w:lsdException w:name="Dark List" w:semiHidden="0" w:uiPriority="70" w:unhideWhenUsed="0"/>
-    <w:lsdException w:name="Colorful Shading" w:semiHidden="0" w:uiPriority="71" w:unhideWhenUsed="0"/>
-    <w:lsdException w:name="Colorful List" w:semiHidden="0" w:uiPriority="72" w:unhideWhenUsed="0"/>
-    <w:lsdException w:name="Colorful Grid" w:semiHidden="0" w:uiPriority="73" w:unhideWhenUsed="0"/>
-    <w:lsdException w:name="Light Shading Accent 1" w:semiHidden="0" w:uiPriority="60" w:unhideWhenUsed="0"/>
-    <w:lsdException w:name="Light List Accent 1" w:semiHidden="0" w:uiPriority="61" w:unhideWhenUsed="0"/>
-    <w:lsdException w:name="Light Grid Accent 1" w:semiHidden="0" w:uiPriority="62" w:unhideWhenUsed="0"/>
-    <w:lsdException w:name="Medium Shading 1 Accent 1" w:semiHidden="0" w:uiPriority="63" w:unhideWhenUsed="0"/>
-    <w:lsdException w:name="Medium Shading 2 Accent 1" w:semiHidden="0" w:uiPriority="64" w:unhideWhenUsed="0"/>
-    <w:lsdException w:name="Medium List 1 Accent 1" w:semiHidden="0" w:uiPriority="65" w:unhideWhenUsed="0"/>
-    <w:lsdException w:name="Revision" w:unhideWhenUsed="0"/>
-    <w:lsdException w:name="List Paragraph" w:semiHidden="0" w:uiPriority="34" w:unhideWhenUsed="0" w:qFormat="1"/>
-    <w:lsdException w:name="Quote" w:semiHidden="0" w:uiPriority="29" w:unhideWhenUsed="0" w:qFormat="1"/>
-    <w:lsdException w:name="Intense Quote" w:semiHidden="0" w:uiPriority="30" w:unhideWhenUsed="0" w:qFormat="1"/>
-    <w:lsdException w:name="Medium List 2 Accent 1" w:semiHidden="0" w:uiPriority="66" w:unhideWhenUsed="0"/>
-    <w:lsdException w:name="Medium Grid 1 Accent 1" w:semiHidden="0" w:uiPriority="67" w:unhideWhenUsed="0"/>
-    <w:lsdException w:name="Medium Grid 2 Accent 1" w:semiHidden="0" w:uiPriority="68" w:unhideWhenUsed="0"/>
-    <w:lsdException w:name="Medium Grid 3 Accent 1" w:semiHidden="0" w:uiPriority="69" w:unhideWhenUsed="0"/>
-    <w:lsdException w:name="Dark List Accent 1" w:semiHidden="0" w:uiPriority="70" w:unhideWhenUsed="0"/>
-    <w:lsdException w:name="Colorful Shading Accent 1" w:semiHidden="0" w:uiPriority="71" w:unhideWhenUsed="0"/>
-    <w:lsdException w:name="Colorful List Accent 1" w:semiHidden="0" w:uiPriority="72" w:unhideWhenUsed="0"/>
-    <w:lsdException w:name="Colorful Grid Accent 1" w:semiHidden="0" w:uiPriority="73" w:unhideWhenUsed="0"/>
-    <w:lsdException w:name="Light Shading Accent 2" w:semiHidden="0" w:uiPriority="60" w:unhideWhenUsed="0"/>
-    <w:lsdException w:name="Light List Accent 2" w:semiHidden="0" w:uiPriority="61" w:unhideWhenUsed="0"/>
-    <w:lsdException w:name="Light Grid Accent 2" w:semiHidden="0" w:uiPriority="62" w:unhideWhenUsed="0"/>
-    <w:lsdException w:name="Medium Shading 1 Accent 2" w:semiHidden="0" w:uiPriority="63" w:unhideWhenUsed="0"/>
-    <w:lsdException w:name="Medium Shading 2 Accent 2" w:semiHidden="0" w:uiPriority="64" w:unhideWhenUsed="0"/>
-    <w:lsdException w:name="Medium List 1 Accent 2" w:semiHidden="0" w:uiPriority="65" w:unhideWhenUsed="0"/>
-    <w:lsdException w:name="Medium List 2 Accent 2" w:semiHidden="0" w:uiPriority="66" w:unhideWhenUsed="0"/>
-    <w:lsdException w:name="Medium Grid 1 Accent 2" w:semiHidden="0" w:uiPriority="67" w:unhideWhenUsed="0"/>
-    <w:lsdException w:name="Medium Grid 2 Accent 2" w:semiHidden="0" w:uiPriority="68" w:unhideWhenUsed="0"/>
-    <w:lsdException w:name="Medium Grid 3 Accent 2" w:semiHidden="0" w:uiPriority="69" w:unhideWhenUsed="0"/>
-    <w:lsdException w:name="Dark List Accent 2" w:semiHidden="0" w:uiPriority="70" w:unhideWhenUsed="0"/>
-    <w:lsdException w:name="Colorful Shading Accent 2" w:semiHidden="0" w:uiPriority="71" w:unhideWhenUsed="0"/>
-    <w:lsdException w:name="Colorful List Accent 2" w:semiHidden="0" w:uiPriority="72" w:unhideWhenUsed="0"/>
-    <w:lsdException w:name="Colorful Grid Accent 2" w:semiHidden="0" w:uiPriority="73" w:unhideWhenUsed="0"/>
-    <w:lsdException w:name="Light Shading Accent 3" w:semiHidden="0" w:uiPriority="60" w:unhideWhenUsed="0"/>
-    <w:lsdException w:name="Light List Accent 3" w:semiHidden="0" w:uiPriority="61" w:unhideWhenUsed="0"/>
-    <w:lsdException w:name="Light Grid Accent 3" w:semiHidden="0" w:uiPriority="62" w:unhideWhenUsed="0"/>
-    <w:lsdException w:name="Medium Shading 1 Accent 3" w:semiHidden="0" w:uiPriority="63" w:unhideWhenUsed="0"/>
-    <w:lsdException w:name="Medium Shading 2 Accent 3" w:semiHidden="0" w:uiPriority="64" w:unhideWhenUsed="0"/>
-    <w:lsdException w:name="Medium List 1 Accent 3" w:semiHidden="0" w:uiPriority="65" w:unhideWhenUsed="0"/>
-    <w:lsdException w:name="Medium List 2 Accent 3" w:semiHidden="0" w:uiPriority="66" w:unhideWhenUsed="0"/>
-    <w:lsdException w:name="Medium Grid 1 Accent 3" w:semiHidden="0" w:uiPriority="67" w:unhideWhenUsed="0"/>
-    <w:lsdException w:name="Medium Grid 2 Accent 3" w:semiHidden="0" w:uiPriority="68" w:unhideWhenUsed="0"/>
-    <w:lsdException w:name="Medium Grid 3 Accent 3" w:semiHidden="0" w:uiPriority="69" w:unhideWhenUsed="0"/>
-    <w:lsdException w:name="Dark List Accent 3" w:semiHidden="0" w:uiPriority="70" w:unhideWhenUsed="0"/>
-    <w:lsdException w:name="Colorful Shading Accent 3" w:semiHidden="0" w:uiPriority="71" w:unhideWhenUsed="0"/>
-    <w:lsdException w:name="Colorful List Accent 3" w:semiHidden="0" w:uiPriority="72" w:unhideWhenUsed="0"/>
-    <w:lsdException w:name="Colorful Grid Accent 3" w:semiHidden="0" w:uiPriority="73" w:unhideWhenUsed="0"/>
-    <w:lsdException w:name="Light Shading Accent 4" w:semiHidden="0" w:uiPriority="60" w:unhideWhenUsed="0"/>
-    <w:lsdException w:name="Light List Accent 4" w:semiHidden="0" w:uiPriority="61" w:unhideWhenUsed="0"/>
-    <w:lsdException w:name="Light Grid Accent 4" w:semiHidden="0" w:uiPriority="62" w:unhideWhenUsed="0"/>
-    <w:lsdException w:name="Medium Shading 1 Accent 4" w:semiHidden="0" w:uiPriority="63" w:unhideWhenUsed="0"/>
-    <w:lsdException w:name="Medium Shading 2 Accent 4" w:semiHidden="0" w:uiPriority="64" w:unhideWhenUsed="0"/>
-    <w:lsdException w:name="Medium List 1 Accent 4" w:semiHidden="0" w:uiPriority="65" w:unhideWhenUsed="0"/>
-    <w:lsdException w:name="Medium List 2 Accent 4" w:semiHidden="0" w:uiPriority="66" w:unhideWhenUsed="0"/>
-    <w:lsdException w:name="Medium Grid 1 Accent 4" w:semiHidden="0" w:uiPriority="67" w:unhideWhenUsed="0"/>
-    <w:lsdException w:name="Medium Grid 2 Accent 4" w:semiHidden="0" w:uiPriority="68" w:unhideWhenUsed="0"/>
-    <w:lsdException w:name="Medium Grid 3 Accent 4" w:semiHidden="0" w:uiPriority="69" w:unhideWhenUsed="0"/>
-    <w:lsdException w:name="Dark List Accent 4" w:semiHidden="0" w:uiPriority="70" w:unhideWhenUsed="0"/>
-    <w:lsdException w:name="Colorful Shading Accent 4" w:semiHidden="0" w:uiPriority="71" w:unhideWhenUsed="0"/>
-    <w:lsdException w:name="Colorful List Accent 4" w:semiHidden="0" w:uiPriority="72" w:unhideWhenUsed="0"/>
-    <w:lsdException w:name="Colorful Grid Accent 4" w:semiHidden="0" w:uiPriority="73" w:unhideWhenUsed="0"/>
-    <w:lsdException w:name="Light Shading Accent 5" w:semiHidden="0" w:uiPriority="60" w:unhideWhenUsed="0"/>
-    <w:lsdException w:name="Light List Accent 5" w:semiHidden="0" w:uiPriority="61" w:unhideWhenUsed="0"/>
-    <w:lsdException w:name="Light Grid Accent 5" w:semiHidden="0" w:uiPriority="62" w:unhideWhenUsed="0"/>
-    <w:lsdException w:name="Medium Shading 1 Accent 5" w:semiHidden="0" w:uiPriority="63" w:unhideWhenUsed="0"/>
-    <w:lsdException w:name="Medium Shading 2 Accent 5" w:semiHidden="0" w:uiPriority="64" w:unhideWhenUsed="0"/>
-    <w:lsdException w:name="Medium List 1 Accent 5" w:semiHidden="0" w:uiPriority="65" w:unhideWhenUsed="0"/>
-    <w:lsdException w:name="Medium List 2 Accent 5" w:semiHidden="0" w:uiPriority="66" w:unhideWhenUsed="0"/>
-    <w:lsdException w:name="Medium Grid 1 Accent 5" w:semiHidden="0" w:uiPriority="67" w:unhideWhenUsed="0"/>
-    <w:lsdException w:name="Medium Grid 2 Accent 5" w:semiHidden="0" w:uiPriority="68" w:unhideWhenUsed="0"/>
-    <w:lsdException w:name="Medium Grid 3 Accent 5" w:semiHidden="0" w:uiPriority="69" w:unhideWhenUsed="0"/>
-    <w:lsdException w:name="Dark List Accent 5" w:semiHidden="0" w:uiPriority="70" w:unhideWhenUsed="0"/>
-    <w:lsdException w:name="Colorful Shading Accent 5" w:semiHidden="0" w:uiPriority="71" w:unhideWhenUsed="0"/>
-    <w:lsdException w:name="Colorful List Accent 5" w:semiHidden="0" w:uiPriority="72" w:unhideWhenUsed="0"/>
-    <w:lsdException w:name="Colorful Grid Accent 5" w:semiHidden="0" w:uiPriority="73" w:unhideWhenUsed="0"/>
-    <w:lsdException w:name="Light Shading Accent 6" w:semiHidden="0" w:uiPriority="60" w:unhideWhenUsed="0"/>
-    <w:lsdException w:name="Light List Accent 6" w:semiHidden="0" w:uiPriority="61" w:unhideWhenUsed="0"/>
-    <w:lsdException w:name="Light Grid Accent 6" w:semiHidden="0" w:uiPriority="62" w:unhideWhenUsed="0"/>
-    <w:lsdException w:name="Medium Shading 1 Accent 6" w:semiHidden="0" w:uiPriority="63" w:unhideWhenUsed="0"/>
-    <w:lsdException w:name="Medium Shading 2 Accent 6" w:semiHidden="0" w:uiPriority="64" w:unhideWhenUsed="0"/>
-    <w:lsdException w:name="Medium List 1 Accent 6" w:semiHidden="0" w:uiPriority="65" w:unhideWhenUsed="0"/>
-    <w:lsdException w:name="Medium List 2 Accent 6" w:semiHidden="0" w:uiPriority="66" w:unhideWhenUsed="0"/>
-    <w:lsdException w:name="Medium Grid 1 Accent 6" w:semiHidden="0" w:uiPriority="67" w:unhideWhenUsed="0"/>
-    <w:lsdException w:name="Medium Grid 2 Accent 6" w:semiHidden="0" w:uiPriority="68" w:unhideWhenUsed="0"/>
-    <w:lsdException w:name="Medium Grid 3 Accent 6" w:semiHidden="0" w:uiPriority="69" w:unhideWhenUsed="0"/>
-    <w:lsdException w:name="Dark List Accent 6" w:semiHidden="0" w:uiPriority="70" w:unhideWhenUsed="0"/>
-    <w:lsdException w:name="Colorful Shading Accent 6" w:semiHidden="0" w:uiPriority="71" w:unhideWhenUsed="0"/>
-    <w:lsdException w:name="Colorful List Accent 6" w:semiHidden="0" w:uiPriority="72" w:unhideWhenUsed="0"/>
-    <w:lsdException w:name="Colorful Grid Accent 6" w:semiHidden="0" w:uiPriority="73" w:unhideWhenUsed="0"/>
-    <w:lsdException w:name="Subtle Emphasis" w:semiHidden="0" w:uiPriority="19" w:unhideWhenUsed="0" w:qFormat="1"/>
-    <w:lsdException w:name="Intense Emphasis" w:semiHidden="0" w:uiPriority="21" w:unhideWhenUsed="0" w:qFormat="1"/>
-    <w:lsdException w:name="Subtle Reference" w:semiHidden="0" w:uiPriority="31" w:unhideWhenUsed="0" w:qFormat="1"/>
-    <w:lsdException w:name="Intense Reference" w:semiHidden="0" w:uiPriority="32" w:unhideWhenUsed="0" w:qFormat="1"/>
-    <w:lsdException w:name="Book Title" w:semiHidden="0" w:uiPriority="33" w:unhideWhenUsed="0" w:qFormat="1"/>
-    <w:lsdException w:name="Bibliography" w:uiPriority="37"/>
-    <w:lsdException w:name="TOC Heading" w:uiPriority="39" w:qFormat="1"/>
+    <w:lsdException w:name="Table Grid" w:semiHidden="0" w:uiPriority="59" w:unhideWhenUsed="0"/>
+    <w:lsdException w:name="Placeholder Text" w:locked="0" w:unhideWhenUsed="0"/>
+    <w:lsdException w:name="No Spacing" w:locked="0" w:semiHidden="0" w:uiPriority="1" w:unhideWhenUsed="0" w:qFormat="1"/>
+    <w:lsdException w:name="Light Shading" w:locked="0" w:semiHidden="0" w:uiPriority="60" w:unhideWhenUsed="0"/>
+    <w:lsdException w:name="Light List" w:locked="0" w:semiHidden="0" w:uiPriority="61" w:unhideWhenUsed="0"/>
+    <w:lsdException w:name="Light Grid" w:locked="0" w:semiHidden="0" w:uiPriority="62" w:unhideWhenUsed="0"/>
+    <w:lsdException w:name="Medium Shading 1" w:locked="0" w:semiHidden="0" w:uiPriority="63" w:unhideWhenUsed="0"/>
+    <w:lsdException w:name="Medium Shading 2" w:locked="0" w:semiHidden="0" w:uiPriority="64" w:unhideWhenUsed="0"/>
+    <w:lsdException w:name="Medium List 1" w:locked="0" w:semiHidden="0" w:uiPriority="65" w:unhideWhenUsed="0"/>
+    <w:lsdException w:name="Medium List 2" w:locked="0" w:semiHidden="0" w:uiPriority="66" w:unhideWhenUsed="0"/>
+    <w:lsdException w:name="Medium Grid 1" w:locked="0" w:semiHidden="0" w:uiPriority="67" w:unhideWhenUsed="0"/>
+    <w:lsdException w:name="Medium Grid 2" w:locked="0" w:semiHidden="0" w:uiPriority="68" w:unhideWhenUsed="0"/>
+    <w:lsdException w:name="Medium Grid 3" w:locked="0" w:semiHidden="0" w:uiPriority="69" w:unhideWhenUsed="0"/>
+    <w:lsdException w:name="Dark List" w:locked="0" w:semiHidden="0" w:uiPriority="70" w:unhideWhenUsed="0"/>
+    <w:lsdException w:name="Colorful Shading" w:locked="0" w:semiHidden="0" w:uiPriority="71" w:unhideWhenUsed="0"/>
+    <w:lsdException w:name="Colorful List" w:locked="0" w:semiHidden="0" w:uiPriority="72" w:unhideWhenUsed="0"/>
+    <w:lsdException w:name="Colorful Grid" w:locked="0" w:semiHidden="0" w:uiPriority="73" w:unhideWhenUsed="0"/>
+    <w:lsdException w:name="Light Shading Accent 1" w:locked="0" w:semiHidden="0" w:uiPriority="60" w:unhideWhenUsed="0"/>
+    <w:lsdException w:name="Light List Accent 1" w:locked="0" w:semiHidden="0" w:uiPriority="61" w:unhideWhenUsed="0"/>
+    <w:lsdException w:name="Light Grid Accent 1" w:locked="0" w:semiHidden="0" w:uiPriority="62" w:unhideWhenUsed="0"/>
+    <w:lsdException w:name="Medium Shading 1 Accent 1" w:locked="0" w:semiHidden="0" w:uiPriority="63" w:unhideWhenUsed="0"/>
+    <w:lsdException w:name="Medium Shading 2 Accent 1" w:locked="0" w:semiHidden="0" w:uiPriority="64" w:unhideWhenUsed="0"/>
+    <w:lsdException w:name="Medium List 1 Accent 1" w:locked="0" w:semiHidden="0" w:uiPriority="65" w:unhideWhenUsed="0"/>
+    <w:lsdException w:name="Revision" w:locked="0" w:unhideWhenUsed="0"/>
+    <w:lsdException w:name="List Paragraph" w:locked="0" w:semiHidden="0" w:uiPriority="34" w:unhideWhenUsed="0" w:qFormat="1"/>
+    <w:lsdException w:name="Quote" w:locked="0" w:semiHidden="0" w:uiPriority="29" w:unhideWhenUsed="0" w:qFormat="1"/>
+    <w:lsdException w:name="Intense Quote" w:locked="0" w:semiHidden="0" w:uiPriority="30" w:unhideWhenUsed="0" w:qFormat="1"/>
+    <w:lsdException w:name="Medium List 2 Accent 1" w:locked="0" w:semiHidden="0" w:uiPriority="66" w:unhideWhenUsed="0"/>
+    <w:lsdException w:name="Medium Grid 1 Accent 1" w:locked="0" w:semiHidden="0" w:uiPriority="67" w:unhideWhenUsed="0"/>
+    <w:lsdException w:name="Medium Grid 2 Accent 1" w:locked="0" w:semiHidden="0" w:uiPriority="68" w:unhideWhenUsed="0"/>
+    <w:lsdException w:name="Medium Grid 3 Accent 1" w:locked="0" w:semiHidden="0" w:uiPriority="69" w:unhideWhenUsed="0"/>
+    <w:lsdException w:name="Dark List Accent 1" w:locked="0" w:semiHidden="0" w:uiPriority="70" w:unhideWhenUsed="0"/>
+    <w:lsdException w:name="Colorful Shading Accent 1" w:locked="0" w:semiHidden="0" w:uiPriority="71" w:unhideWhenUsed="0"/>
+    <w:lsdException w:name="Colorful List Accent 1" w:locked="0" w:semiHidden="0" w:uiPriority="72" w:unhideWhenUsed="0"/>
+    <w:lsdException w:name="Colorful Grid Accent 1" w:locked="0" w:semiHidden="0" w:uiPriority="73" w:unhideWhenUsed="0"/>
+    <w:lsdException w:name="Light Shading Accent 2" w:locked="0" w:semiHidden="0" w:uiPriority="60" w:unhideWhenUsed="0"/>
+    <w:lsdException w:name="Light List Accent 2" w:locked="0" w:semiHidden="0" w:uiPriority="61" w:unhideWhenUsed="0"/>
+    <w:lsdException w:name="Light Grid Accent 2" w:locked="0" w:semiHidden="0" w:uiPriority="62" w:unhideWhenUsed="0"/>
+    <w:lsdException w:name="Medium Shading 1 Accent 2" w:locked="0" w:semiHidden="0" w:uiPriority="63" w:unhideWhenUsed="0"/>
+    <w:lsdException w:name="Medium Shading 2 Accent 2" w:locked="0" w:semiHidden="0" w:uiPriority="64" w:unhideWhenUsed="0"/>
+    <w:lsdException w:name="Medium List 1 Accent 2" w:locked="0" w:semiHidden="0" w:uiPriority="65" w:unhideWhenUsed="0"/>
+    <w:lsdException w:name="Medium List 2 Accent 2" w:locked="0" w:semiHidden="0" w:uiPriority="66" w:unhideWhenUsed="0"/>
+    <w:lsdException w:name="Medium Grid 1 Accent 2" w:locked="0" w:semiHidden="0" w:uiPriority="67" w:unhideWhenUsed="0"/>
+    <w:lsdException w:name="Medium Grid 2 Accent 2" w:locked="0" w:semiHidden="0" w:uiPriority="68" w:unhideWhenUsed="0"/>
+    <w:lsdException w:name="Medium Grid 3 Accent 2" w:locked="0" w:semiHidden="0" w:uiPriority="69" w:unhideWhenUsed="0"/>
+    <w:lsdException w:name="Dark List Accent 2" w:locked="0" w:semiHidden="0" w:uiPriority="70" w:unhideWhenUsed="0"/>
+    <w:lsdException w:name="Colorful Shading Accent 2" w:locked="0" w:semiHidden="0" w:uiPriority="71" w:unhideWhenUsed="0"/>
+    <w:lsdException w:name="Colorful List Accent 2" w:locked="0" w:semiHidden="0" w:uiPriority="72" w:unhideWhenUsed="0"/>
+    <w:lsdException w:name="Colorful Grid Accent 2" w:locked="0" w:semiHidden="0" w:uiPriority="73" w:unhideWhenUsed="0"/>
+    <w:lsdException w:name="Light Shading Accent 3" w:locked="0" w:semiHidden="0" w:uiPriority="60" w:unhideWhenUsed="0"/>
+    <w:lsdException w:name="Light List Accent 3" w:locked="0" w:semiHidden="0" w:uiPriority="61" w:unhideWhenUsed="0"/>
+    <w:lsdException w:name="Light Grid Accent 3" w:locked="0" w:semiHidden="0" w:uiPriority="62" w:unhideWhenUsed="0"/>
+    <w:lsdException w:name="Medium Shading 1 Accent 3" w:locked="0" w:semiHidden="0" w:uiPriority="63" w:unhideWhenUsed="0"/>
+    <w:lsdException w:name="Medium Shading 2 Accent 3" w:locked="0" w:semiHidden="0" w:uiPriority="64" w:unhideWhenUsed="0"/>
+    <w:lsdException w:name="Medium List 1 Accent 3" w:locked="0" w:semiHidden="0" w:uiPriority="65" w:unhideWhenUsed="0"/>
+    <w:lsdException w:name="Medium List 2 Accent 3" w:locked="0" w:semiHidden="0" w:uiPriority="66" w:unhideWhenUsed="0"/>
+    <w:lsdException w:name="Medium Grid 1 Accent 3" w:locked="0" w:semiHidden="0" w:uiPriority="67" w:unhideWhenUsed="0"/>
+    <w:lsdException w:name="Medium Grid 2 Accent 3" w:locked="0" w:semiHidden="0" w:uiPriority="68" w:unhideWhenUsed="0"/>
+    <w:lsdException w:name="Medium Grid 3 Accent 3" w:locked="0" w:semiHidden="0" w:uiPriority="69" w:unhideWhenUsed="0"/>
+    <w:lsdException w:name="Dark List Accent 3" w:locked="0" w:semiHidden="0" w:uiPriority="70" w:unhideWhenUsed="0"/>
+    <w:lsdException w:name="Colorful Shading Accent 3" w:locked="0" w:semiHidden="0" w:uiPriority="71" w:unhideWhenUsed="0"/>
+    <w:lsdException w:name="Colorful List Accent 3" w:locked="0" w:semiHidden="0" w:uiPriority="72" w:unhideWhenUsed="0"/>
+    <w:lsdException w:name="Colorful Grid Accent 3" w:locked="0" w:semiHidden="0" w:uiPriority="73" w:unhideWhenUsed="0"/>
+    <w:lsdException w:name="Light Shading Accent 4" w:locked="0" w:semiHidden="0" w:uiPriority="60" w:unhideWhenUsed="0"/>
+    <w:lsdException w:name="Light List Accent 4" w:locked="0" w:semiHidden="0" w:uiPriority="61" w:unhideWhenUsed="0"/>
+    <w:lsdException w:name="Light Grid Accent 4" w:locked="0" w:semiHidden="0" w:uiPriority="62" w:unhideWhenUsed="0"/>
+    <w:lsdException w:name="Medium Shading 1 Accent 4" w:locked="0" w:semiHidden="0" w:uiPriority="63" w:unhideWhenUsed="0"/>
+    <w:lsdException w:name="Medium Shading 2 Accent 4" w:locked="0" w:semiHidden="0" w:uiPriority="64" w:unhideWhenUsed="0"/>
+    <w:lsdException w:name="Medium List 1 Accent 4" w:locked="0" w:semiHidden="0" w:uiPriority="65" w:unhideWhenUsed="0"/>
+    <w:lsdException w:name="Medium List 2 Accent 4" w:locked="0" w:semiHidden="0" w:uiPriority="66" w:unhideWhenUsed="0"/>
+    <w:lsdException w:name="Medium Grid 1 Accent 4" w:locked="0" w:semiHidden="0" w:uiPriority="67" w:unhideWhenUsed="0"/>
+    <w:lsdException w:name="Medium Grid 2 Accent 4" w:locked="0" w:semiHidden="0" w:uiPriority="68" w:unhideWhenUsed="0"/>
+    <w:lsdException w:name="Medium Grid 3 Accent 4" w:locked="0" w:semiHidden="0" w:uiPriority="69" w:unhideWhenUsed="0"/>
+    <w:lsdException w:name="Dark List Accent 4" w:locked="0" w:semiHidden="0" w:uiPriority="70" w:unhideWhenUsed="0"/>
+    <w:lsdException w:name="Colorful Shading Accent 4" w:locked="0" w:semiHidden="0" w:uiPriority="71" w:unhideWhenUsed="0"/>
+    <w:lsdException w:name="Colorful List Accent 4" w:locked="0" w:semiHidden="0" w:uiPriority="72" w:unhideWhenUsed="0"/>
+    <w:lsdException w:name="Colorful Grid Accent 4" w:locked="0" w:semiHidden="0" w:uiPriority="73" w:unhideWhenUsed="0"/>
+    <w:lsdException w:name="Light Shading Accent 5" w:locked="0" w:semiHidden="0" w:uiPriority="60" w:unhideWhenUsed="0"/>
+    <w:lsdException w:name="Light List Accent 5" w:locked="0" w:semiHidden="0" w:uiPriority="61" w:unhideWhenUsed="0"/>
+    <w:lsdException w:name="Light Grid Accent 5" w:locked="0" w:semiHidden="0" w:uiPriority="62" w:unhideWhenUsed="0"/>
+    <w:lsdException w:name="Medium Shading 1 Accent 5" w:locked="0" w:semiHidden="0" w:uiPriority="63" w:unhideWhenUsed="0"/>
+    <w:lsdException w:name="Medium Shading 2 Accent 5" w:locked="0" w:semiHidden="0" w:uiPriority="64" w:unhideWhenUsed="0"/>
+    <w:lsdException w:name="Medium List 1 Accent 5" w:locked="0" w:semiHidden="0" w:uiPriority="65" w:unhideWhenUsed="0"/>
+    <w:lsdException w:name="Medium List 2 Accent 5" w:locked="0" w:semiHidden="0" w:uiPriority="66" w:unhideWhenUsed="0"/>
+    <w:lsdException w:name="Medium Grid 1 Accent 5" w:locked="0" w:semiHidden="0" w:uiPriority="67" w:unhideWhenUsed="0"/>
+    <w:lsdException w:name="Medium Grid 2 Accent 5" w:locked="0" w:semiHidden="0" w:uiPriority="68" w:unhideWhenUsed="0"/>
+    <w:lsdException w:name="Medium Grid 3 Accent 5" w:locked="0" w:semiHidden="0" w:uiPriority="69" w:unhideWhenUsed="0"/>
+    <w:lsdException w:name="Dark List Accent 5" w:locked="0" w:semiHidden="0" w:uiPriority="70" w:unhideWhenUsed="0"/>
+    <w:lsdException w:name="Colorful Shading Accent 5" w:locked="0" w:semiHidden="0" w:uiPriority="71" w:unhideWhenUsed="0"/>
+    <w:lsdException w:name="Colorful List Accent 5" w:locked="0" w:semiHidden="0" w:uiPriority="72" w:unhideWhenUsed="0"/>
+    <w:lsdException w:name="Colorful Grid Accent 5" w:locked="0" w:semiHidden="0" w:uiPriority="73" w:unhideWhenUsed="0"/>
+    <w:lsdException w:name="Light Shading Accent 6" w:locked="0" w:semiHidden="0" w:uiPriority="60" w:unhideWhenUsed="0"/>
+    <w:lsdException w:name="Light List Accent 6" w:locked="0" w:semiHidden="0" w:uiPriority="61" w:unhideWhenUsed="0"/>
+    <w:lsdException w:name="Light Grid Accent 6" w:locked="0" w:semiHidden="0" w:uiPriority="62" w:unhideWhenUsed="0"/>
+    <w:lsdException w:name="Medium Shading 1 Accent 6" w:locked="0" w:semiHidden="0" w:uiPriority="63" w:unhideWhenUsed="0"/>
+    <w:lsdException w:name="Medium Shading 2 Accent 6" w:locked="0" w:semiHidden="0" w:uiPriority="64" w:unhideWhenUsed="0"/>
+    <w:lsdException w:name="Medium List 1 Accent 6" w:locked="0" w:semiHidden="0" w:uiPriority="65" w:unhideWhenUsed="0"/>
+    <w:lsdException w:name="Medium List 2 Accent 6" w:locked="0" w:semiHidden="0" w:uiPriority="66" w:unhideWhenUsed="0"/>
+    <w:lsdException w:name="Medium Grid 1 Accent 6" w:locked="0" w:semiHidden="0" w:uiPriority="67" w:unhideWhenUsed="0"/>
+    <w:lsdException w:name="Medium Grid 2 Accent 6" w:locked="0" w:semiHidden="0" w:uiPriority="68" w:unhideWhenUsed="0"/>
+    <w:lsdException w:name="Medium Grid 3 Accent 6" w:locked="0" w:semiHidden="0" w:uiPriority="69" w:unhideWhenUsed="0"/>
+    <w:lsdException w:name="Dark List Accent 6" w:locked="0" w:semiHidden="0" w:uiPriority="70" w:unhideWhenUsed="0"/>
+    <w:lsdException w:name="Colorful Shading Accent 6" w:locked="0" w:semiHidden="0" w:uiPriority="71" w:unhideWhenUsed="0"/>
+    <w:lsdException w:name="Colorful List Accent 6" w:locked="0" w:semiHidden="0" w:uiPriority="72" w:unhideWhenUsed="0"/>
+    <w:lsdException w:name="Colorful Grid Accent 6" w:locked="0" w:semiHidden="0" w:uiPriority="73" w:unhideWhenUsed="0"/>
+    <w:lsdException w:name="Subtle Emphasis" w:locked="0" w:semiHidden="0" w:uiPriority="19" w:unhideWhenUsed="0" w:qFormat="1"/>
+    <w:lsdException w:name="Intense Emphasis" w:locked="0" w:semiHidden="0" w:uiPriority="21" w:unhideWhenUsed="0" w:qFormat="1"/>
+    <w:lsdException w:name="Subtle Reference" w:locked="0" w:semiHidden="0" w:uiPriority="31" w:unhideWhenUsed="0" w:qFormat="1"/>
+    <w:lsdException w:name="Intense Reference" w:locked="0" w:semiHidden="0" w:uiPriority="32" w:unhideWhenUsed="0" w:qFormat="1"/>
+    <w:lsdException w:name="Book Title" w:locked="0" w:semiHidden="0" w:uiPriority="33" w:unhideWhenUsed="0" w:qFormat="1"/>
+    <w:lsdException w:name="Bibliography" w:locked="0" w:uiPriority="37"/>
+    <w:lsdException w:name="TOC Heading" w:locked="0" w:uiPriority="39" w:qFormat="1"/>
   </w:latentStyles>
   <w:style w:type="paragraph" w:default="1" w:styleId="Normal">
     <w:name w:val="Normal"/>
@@ -1773,10 +1677,9 @@
     <w:rsid w:val="0072424B"/>
     <w:pPr>
       <w:suppressAutoHyphens/>
-      <w:spacing w:after="0" w:line="240" w:lineRule="auto"/>
     </w:pPr>
     <w:rPr>
-      <w:rFonts w:ascii="Times New Roman" w:eastAsia="Times New Roman" w:hAnsi="Times New Roman" w:cs="Times New Roman"/>
+      <w:rFonts w:ascii="Times New Roman" w:eastAsia="Times New Roman" w:hAnsi="Times New Roman"/>
       <w:sz w:val="20"/>
       <w:szCs w:val="20"/>
       <w:lang w:val="en-AU" w:eastAsia="ar-SA"/>
@@ -1787,6 +1690,7 @@
     <w:basedOn w:val="Normal"/>
     <w:next w:val="Normal"/>
     <w:link w:val="Heading2Char"/>
+    <w:uiPriority w:val="99"/>
     <w:qFormat/>
     <w:rsid w:val="0072424B"/>
     <w:pPr>
@@ -1796,6 +1700,7 @@
     </w:pPr>
     <w:rPr>
       <w:b/>
+      <w:bCs/>
       <w:lang w:val="bg-BG"/>
     </w:rPr>
   </w:style>
@@ -1804,6 +1709,7 @@
     <w:basedOn w:val="Normal"/>
     <w:next w:val="Normal"/>
     <w:link w:val="Heading4Char"/>
+    <w:uiPriority w:val="99"/>
     <w:qFormat/>
     <w:rsid w:val="0072424B"/>
     <w:pPr>
@@ -1812,8 +1718,9 @@
       <w:outlineLvl w:val="3"/>
     </w:pPr>
     <w:rPr>
-      <w:rFonts w:ascii="Arial" w:hAnsi="Arial"/>
+      <w:rFonts w:ascii="Arial" w:hAnsi="Arial" w:cs="Arial"/>
       <w:i/>
+      <w:iCs/>
       <w:lang w:val="bg-BG"/>
     </w:rPr>
   </w:style>
@@ -1822,7 +1729,7 @@
     <w:basedOn w:val="Normal"/>
     <w:next w:val="Normal"/>
     <w:link w:val="Heading7Char"/>
-    <w:unhideWhenUsed/>
+    <w:uiPriority w:val="99"/>
     <w:qFormat/>
     <w:rsid w:val="00A46381"/>
     <w:pPr>
@@ -1832,23 +1739,23 @@
       <w:outlineLvl w:val="6"/>
     </w:pPr>
     <w:rPr>
-      <w:rFonts w:asciiTheme="majorHAnsi" w:eastAsiaTheme="majorEastAsia" w:hAnsiTheme="majorHAnsi" w:cstheme="majorBidi"/>
+      <w:rFonts w:ascii="Cambria" w:hAnsi="Cambria" w:cs="Cambria"/>
       <w:i/>
       <w:iCs/>
-      <w:color w:val="404040" w:themeColor="text1" w:themeTint="BF"/>
+      <w:color w:val="404040"/>
     </w:rPr>
   </w:style>
   <w:style w:type="character" w:default="1" w:styleId="DefaultParagraphFont">
     <w:name w:val="Default Paragraph Font"/>
-    <w:uiPriority w:val="1"/>
+    <w:uiPriority w:val="99"/>
     <w:semiHidden/>
-    <w:unhideWhenUsed/>
   </w:style>
   <w:style w:type="table" w:default="1" w:styleId="TableNormal">
     <w:name w:val="Normal Table"/>
     <w:uiPriority w:val="99"/>
     <w:semiHidden/>
     <w:unhideWhenUsed/>
+    <w:qFormat/>
     <w:tblPr>
       <w:tblInd w:w="0" w:type="dxa"/>
       <w:tblCellMar>
@@ -1869,43 +1776,70 @@
     <w:name w:val="Heading 2 Char"/>
     <w:basedOn w:val="DefaultParagraphFont"/>
     <w:link w:val="Heading2"/>
+    <w:uiPriority w:val="99"/>
+    <w:locked/>
     <w:rsid w:val="0072424B"/>
     <w:rPr>
-      <w:rFonts w:ascii="Times New Roman" w:eastAsia="Times New Roman" w:hAnsi="Times New Roman" w:cs="Times New Roman"/>
+      <w:rFonts w:ascii="Times New Roman" w:hAnsi="Times New Roman" w:cs="Times New Roman"/>
       <w:b/>
+      <w:bCs/>
       <w:sz w:val="20"/>
       <w:szCs w:val="20"/>
-      <w:lang w:val="bg-BG" w:eastAsia="ar-SA"/>
+      <w:lang w:val="bg-BG" w:eastAsia="ar-SA" w:bidi="ar-SA"/>
     </w:rPr>
   </w:style>
   <w:style w:type="character" w:customStyle="1" w:styleId="Heading4Char">
     <w:name w:val="Heading 4 Char"/>
     <w:basedOn w:val="DefaultParagraphFont"/>
     <w:link w:val="Heading4"/>
+    <w:uiPriority w:val="99"/>
+    <w:locked/>
     <w:rsid w:val="0072424B"/>
     <w:rPr>
-      <w:rFonts w:ascii="Arial" w:eastAsia="Times New Roman" w:hAnsi="Arial" w:cs="Times New Roman"/>
+      <w:rFonts w:ascii="Arial" w:hAnsi="Arial" w:cs="Arial"/>
       <w:i/>
+      <w:iCs/>
       <w:sz w:val="20"/>
       <w:szCs w:val="20"/>
-      <w:lang w:val="bg-BG" w:eastAsia="ar-SA"/>
+      <w:lang w:val="bg-BG" w:eastAsia="ar-SA" w:bidi="ar-SA"/>
+    </w:rPr>
+  </w:style>
+  <w:style w:type="character" w:customStyle="1" w:styleId="Heading7Char">
+    <w:name w:val="Heading 7 Char"/>
+    <w:basedOn w:val="DefaultParagraphFont"/>
+    <w:link w:val="Heading7"/>
+    <w:uiPriority w:val="99"/>
+    <w:semiHidden/>
+    <w:locked/>
+    <w:rsid w:val="00A46381"/>
+    <w:rPr>
+      <w:rFonts w:ascii="Cambria" w:hAnsi="Cambria" w:cs="Cambria"/>
+      <w:i/>
+      <w:iCs/>
+      <w:color w:val="404040"/>
+      <w:sz w:val="20"/>
+      <w:szCs w:val="20"/>
+      <w:lang w:val="en-AU" w:eastAsia="ar-SA" w:bidi="ar-SA"/>
     </w:rPr>
   </w:style>
   <w:style w:type="character" w:styleId="PageNumber">
     <w:name w:val="page number"/>
     <w:basedOn w:val="DefaultParagraphFont"/>
+    <w:uiPriority w:val="99"/>
     <w:rsid w:val="0072424B"/>
   </w:style>
   <w:style w:type="paragraph" w:styleId="BodyText">
     <w:name w:val="Body Text"/>
     <w:basedOn w:val="Normal"/>
     <w:link w:val="BodyTextChar"/>
+    <w:uiPriority w:val="99"/>
     <w:rsid w:val="0072424B"/>
     <w:pPr>
       <w:jc w:val="both"/>
     </w:pPr>
     <w:rPr>
       <w:sz w:val="28"/>
+      <w:szCs w:val="28"/>
       <w:lang w:val="bg-BG"/>
     </w:rPr>
   </w:style>
@@ -1913,26 +1847,27 @@
     <w:name w:val="Body Text Char"/>
     <w:basedOn w:val="DefaultParagraphFont"/>
     <w:link w:val="BodyText"/>
+    <w:uiPriority w:val="99"/>
+    <w:locked/>
     <w:rsid w:val="0072424B"/>
     <w:rPr>
-      <w:rFonts w:ascii="Times New Roman" w:eastAsia="Times New Roman" w:hAnsi="Times New Roman" w:cs="Times New Roman"/>
-      <w:sz w:val="28"/>
+      <w:rFonts w:ascii="Times New Roman" w:hAnsi="Times New Roman" w:cs="Times New Roman"/>
+      <w:sz w:val="20"/>
       <w:szCs w:val="20"/>
-      <w:lang w:val="bg-BG" w:eastAsia="ar-SA"/>
+      <w:lang w:val="bg-BG" w:eastAsia="ar-SA" w:bidi="ar-SA"/>
     </w:rPr>
   </w:style>
   <w:style w:type="paragraph" w:styleId="List">
     <w:name w:val="List"/>
     <w:basedOn w:val="BodyText"/>
+    <w:uiPriority w:val="99"/>
     <w:rsid w:val="0072424B"/>
-    <w:rPr>
-      <w:rFonts w:cs="Lucidasans"/>
-    </w:rPr>
   </w:style>
   <w:style w:type="paragraph" w:styleId="Header">
     <w:name w:val="header"/>
     <w:basedOn w:val="Normal"/>
     <w:link w:val="HeaderChar"/>
+    <w:uiPriority w:val="99"/>
     <w:rsid w:val="0072424B"/>
     <w:pPr>
       <w:tabs>
@@ -1945,18 +1880,21 @@
     <w:name w:val="Header Char"/>
     <w:basedOn w:val="DefaultParagraphFont"/>
     <w:link w:val="Header"/>
+    <w:uiPriority w:val="99"/>
+    <w:locked/>
     <w:rsid w:val="0072424B"/>
     <w:rPr>
-      <w:rFonts w:ascii="Times New Roman" w:eastAsia="Times New Roman" w:hAnsi="Times New Roman" w:cs="Times New Roman"/>
+      <w:rFonts w:ascii="Times New Roman" w:hAnsi="Times New Roman" w:cs="Times New Roman"/>
       <w:sz w:val="20"/>
       <w:szCs w:val="20"/>
-      <w:lang w:val="en-AU" w:eastAsia="ar-SA"/>
+      <w:lang w:val="en-AU" w:eastAsia="ar-SA" w:bidi="ar-SA"/>
     </w:rPr>
   </w:style>
   <w:style w:type="paragraph" w:styleId="Footer">
     <w:name w:val="footer"/>
     <w:basedOn w:val="Normal"/>
     <w:link w:val="FooterChar"/>
+    <w:uiPriority w:val="99"/>
     <w:rsid w:val="0072424B"/>
     <w:pPr>
       <w:tabs>
@@ -1969,12 +1907,14 @@
     <w:name w:val="Footer Char"/>
     <w:basedOn w:val="DefaultParagraphFont"/>
     <w:link w:val="Footer"/>
+    <w:uiPriority w:val="99"/>
+    <w:locked/>
     <w:rsid w:val="0072424B"/>
     <w:rPr>
-      <w:rFonts w:ascii="Times New Roman" w:eastAsia="Times New Roman" w:hAnsi="Times New Roman" w:cs="Times New Roman"/>
+      <w:rFonts w:ascii="Times New Roman" w:hAnsi="Times New Roman" w:cs="Times New Roman"/>
       <w:sz w:val="20"/>
       <w:szCs w:val="20"/>
-      <w:lang w:val="en-AU" w:eastAsia="ar-SA"/>
+      <w:lang w:val="en-AU" w:eastAsia="ar-SA" w:bidi="ar-SA"/>
     </w:rPr>
   </w:style>
   <w:style w:type="paragraph" w:styleId="Title">
@@ -1982,6 +1922,7 @@
     <w:basedOn w:val="Normal"/>
     <w:next w:val="Subtitle"/>
     <w:link w:val="TitleChar"/>
+    <w:uiPriority w:val="99"/>
     <w:qFormat/>
     <w:rsid w:val="0072424B"/>
     <w:pPr>
@@ -1991,6 +1932,7 @@
       <w:b/>
       <w:bCs/>
       <w:sz w:val="24"/>
+      <w:szCs w:val="24"/>
       <w:lang w:val="bg-BG"/>
     </w:rPr>
   </w:style>
@@ -1998,14 +1940,16 @@
     <w:name w:val="Title Char"/>
     <w:basedOn w:val="DefaultParagraphFont"/>
     <w:link w:val="Title"/>
+    <w:uiPriority w:val="99"/>
+    <w:locked/>
     <w:rsid w:val="0072424B"/>
     <w:rPr>
-      <w:rFonts w:ascii="Times New Roman" w:eastAsia="Times New Roman" w:hAnsi="Times New Roman" w:cs="Times New Roman"/>
+      <w:rFonts w:ascii="Times New Roman" w:hAnsi="Times New Roman" w:cs="Times New Roman"/>
       <w:b/>
       <w:bCs/>
-      <w:sz w:val="24"/>
+      <w:sz w:val="20"/>
       <w:szCs w:val="20"/>
-      <w:lang w:val="bg-BG" w:eastAsia="ar-SA"/>
+      <w:lang w:val="bg-BG" w:eastAsia="ar-SA" w:bidi="ar-SA"/>
     </w:rPr>
   </w:style>
   <w:style w:type="paragraph" w:styleId="Subtitle">
@@ -2013,6 +1957,7 @@
     <w:basedOn w:val="Normal"/>
     <w:next w:val="BodyText"/>
     <w:link w:val="SubtitleChar"/>
+    <w:uiPriority w:val="99"/>
     <w:qFormat/>
     <w:rsid w:val="0072424B"/>
     <w:pPr>
@@ -2029,23 +1974,27 @@
     <w:name w:val="Subtitle Char"/>
     <w:basedOn w:val="DefaultParagraphFont"/>
     <w:link w:val="Subtitle"/>
+    <w:uiPriority w:val="99"/>
+    <w:locked/>
     <w:rsid w:val="0072424B"/>
     <w:rPr>
-      <w:rFonts w:ascii="Arial" w:eastAsia="Times New Roman" w:hAnsi="Arial" w:cs="Arial"/>
+      <w:rFonts w:ascii="Arial" w:hAnsi="Arial" w:cs="Arial"/>
       <w:sz w:val="24"/>
       <w:szCs w:val="24"/>
-      <w:lang w:val="en-AU" w:eastAsia="ar-SA"/>
+      <w:lang w:val="en-AU" w:eastAsia="ar-SA" w:bidi="ar-SA"/>
     </w:rPr>
   </w:style>
   <w:style w:type="table" w:styleId="TableGrid">
     <w:name w:val="Table Grid"/>
     <w:basedOn w:val="TableNormal"/>
+    <w:uiPriority w:val="99"/>
     <w:rsid w:val="00C4009E"/>
-    <w:pPr>
-      <w:spacing w:after="0" w:line="240" w:lineRule="auto"/>
-    </w:pPr>
+    <w:rPr>
+      <w:rFonts w:cs="Calibri"/>
+      <w:sz w:val="20"/>
+      <w:szCs w:val="20"/>
+    </w:rPr>
     <w:tblPr>
-      <w:tblInd w:w="0" w:type="dxa"/>
       <w:tblBorders>
         <w:top w:val="single" w:sz="4" w:space="0" w:color="auto"/>
         <w:left w:val="single" w:sz="4" w:space="0" w:color="auto"/>
@@ -2062,40 +2011,21 @@
       </w:tblCellMar>
     </w:tblPr>
   </w:style>
-  <w:style w:type="character" w:customStyle="1" w:styleId="Heading7Char">
-    <w:name w:val="Heading 7 Char"/>
-    <w:basedOn w:val="DefaultParagraphFont"/>
-    <w:link w:val="Heading7"/>
-    <w:uiPriority w:val="9"/>
-    <w:semiHidden/>
-    <w:rsid w:val="00A46381"/>
-    <w:rPr>
-      <w:rFonts w:asciiTheme="majorHAnsi" w:eastAsiaTheme="majorEastAsia" w:hAnsiTheme="majorHAnsi" w:cstheme="majorBidi"/>
-      <w:i/>
-      <w:iCs/>
-      <w:color w:val="404040" w:themeColor="text1" w:themeTint="BF"/>
-      <w:sz w:val="20"/>
-      <w:szCs w:val="20"/>
-      <w:lang w:val="en-AU" w:eastAsia="ar-SA"/>
-    </w:rPr>
-  </w:style>
   <w:style w:type="table" w:styleId="TableWeb1">
     <w:name w:val="Table Web 1"/>
     <w:basedOn w:val="TableNormal"/>
+    <w:uiPriority w:val="99"/>
     <w:rsid w:val="00A46381"/>
     <w:pPr>
       <w:suppressAutoHyphens/>
-      <w:spacing w:after="0" w:line="240" w:lineRule="auto"/>
     </w:pPr>
     <w:rPr>
-      <w:rFonts w:ascii="Times New Roman" w:eastAsia="Times New Roman" w:hAnsi="Times New Roman" w:cs="Times New Roman"/>
+      <w:rFonts w:ascii="Times New Roman" w:eastAsia="Times New Roman" w:hAnsi="Times New Roman"/>
       <w:sz w:val="20"/>
       <w:szCs w:val="20"/>
-      <w:lang w:val="bg-BG" w:eastAsia="bg-BG"/>
     </w:rPr>
     <w:tblPr>
       <w:tblCellSpacing w:w="20" w:type="dxa"/>
-      <w:tblInd w:w="0" w:type="dxa"/>
       <w:tblBorders>
         <w:top w:val="outset" w:sz="6" w:space="0" w:color="auto"/>
         <w:left w:val="outset" w:sz="6" w:space="0" w:color="auto"/>
@@ -2114,537 +2044,6 @@
     <w:trPr>
       <w:tblCellSpacing w:w="20" w:type="dxa"/>
     </w:trPr>
-    <w:tcPr>
-      <w:shd w:val="clear" w:color="auto" w:fill="auto"/>
-    </w:tcPr>
-    <w:tblStylePr w:type="firstRow">
-      <w:rPr>
-        <w:color w:val="auto"/>
-      </w:rPr>
-      <w:tblPr/>
-      <w:tcPr>
-        <w:tcBorders>
-          <w:tl2br w:val="none" w:sz="0" w:space="0" w:color="auto"/>
-          <w:tr2bl w:val="none" w:sz="0" w:space="0" w:color="auto"/>
-        </w:tcBorders>
-      </w:tcPr>
-    </w:tblStylePr>
-  </w:style>
-</w:styles>
-</file>
-
-<file path=word/stylesWithEffects.xml><?xml version="1.0" encoding="utf-8"?>
-<w:styles xmlns:wpc="http://schemas.microsoft.com/office/word/2010/wordprocessingCanvas" xmlns:mc="http://schemas.openxmlformats.org/markup-compatibility/2006" xmlns:o="urn:schemas-microsoft-com:office:office" xmlns:r="http://schemas.openxmlformats.org/officeDocument/2006/relationships" xmlns:m="http://schemas.openxmlformats.org/officeDocument/2006/math" xmlns:v="urn:schemas-microsoft-com:vml" xmlns:wp14="http://schemas.microsoft.com/office/word/2010/wordprocessingDrawing" xmlns:wp="http://schemas.openxmlformats.org/drawingml/2006/wordprocessingDrawing" xmlns:w10="urn:schemas-microsoft-com:office:word" xmlns:w="http://schemas.openxmlformats.org/wordprocessingml/2006/main" xmlns:w14="http://schemas.microsoft.com/office/word/2010/wordml" xmlns:wpg="http://schemas.microsoft.com/office/word/2010/wordprocessingGroup" xmlns:wpi="http://schemas.microsoft.com/office/word/2010/wordprocessingInk" xmlns:wne="http://schemas.microsoft.com/office/word/2006/wordml" xmlns:wps="http://schemas.microsoft.com/office/word/2010/wordprocessingShape" mc:Ignorable="w14 wp14">
-  <w:docDefaults>
-    <w:rPrDefault>
-      <w:rPr>
-        <w:rFonts w:asciiTheme="minorHAnsi" w:eastAsiaTheme="minorHAnsi" w:hAnsiTheme="minorHAnsi" w:cstheme="minorBidi"/>
-        <w:sz w:val="22"/>
-        <w:szCs w:val="22"/>
-        <w:lang w:val="en-US" w:eastAsia="en-US" w:bidi="ar-SA"/>
-      </w:rPr>
-    </w:rPrDefault>
-    <w:pPrDefault>
-      <w:pPr>
-        <w:spacing w:after="200" w:line="276" w:lineRule="auto"/>
-      </w:pPr>
-    </w:pPrDefault>
-  </w:docDefaults>
-  <w:latentStyles w:defLockedState="0" w:defUIPriority="99" w:defSemiHidden="1" w:defUnhideWhenUsed="1" w:defQFormat="0" w:count="267">
-    <w:lsdException w:name="Normal" w:semiHidden="0" w:uiPriority="0" w:unhideWhenUsed="0" w:qFormat="1"/>
-    <w:lsdException w:name="heading 1" w:semiHidden="0" w:uiPriority="9" w:unhideWhenUsed="0" w:qFormat="1"/>
-    <w:lsdException w:name="heading 2" w:uiPriority="0" w:qFormat="1"/>
-    <w:lsdException w:name="heading 3" w:uiPriority="9" w:qFormat="1"/>
-    <w:lsdException w:name="heading 4" w:uiPriority="0" w:qFormat="1"/>
-    <w:lsdException w:name="heading 5" w:uiPriority="9" w:qFormat="1"/>
-    <w:lsdException w:name="heading 6" w:uiPriority="9" w:qFormat="1"/>
-    <w:lsdException w:name="heading 7" w:uiPriority="0" w:qFormat="1"/>
-    <w:lsdException w:name="heading 8" w:uiPriority="9" w:qFormat="1"/>
-    <w:lsdException w:name="heading 9" w:uiPriority="9" w:qFormat="1"/>
-    <w:lsdException w:name="toc 1" w:uiPriority="39"/>
-    <w:lsdException w:name="toc 2" w:uiPriority="39"/>
-    <w:lsdException w:name="toc 3" w:uiPriority="39"/>
-    <w:lsdException w:name="toc 4" w:uiPriority="39"/>
-    <w:lsdException w:name="toc 5" w:uiPriority="39"/>
-    <w:lsdException w:name="toc 6" w:uiPriority="39"/>
-    <w:lsdException w:name="toc 7" w:uiPriority="39"/>
-    <w:lsdException w:name="toc 8" w:uiPriority="39"/>
-    <w:lsdException w:name="toc 9" w:uiPriority="39"/>
-    <w:lsdException w:name="header" w:uiPriority="0"/>
-    <w:lsdException w:name="footer" w:uiPriority="0"/>
-    <w:lsdException w:name="caption" w:uiPriority="35" w:qFormat="1"/>
-    <w:lsdException w:name="page number" w:uiPriority="0"/>
-    <w:lsdException w:name="List" w:uiPriority="0"/>
-    <w:lsdException w:name="Title" w:semiHidden="0" w:uiPriority="0" w:unhideWhenUsed="0" w:qFormat="1"/>
-    <w:lsdException w:name="Default Paragraph Font" w:uiPriority="1"/>
-    <w:lsdException w:name="Body Text" w:uiPriority="0"/>
-    <w:lsdException w:name="Subtitle" w:semiHidden="0" w:uiPriority="0" w:unhideWhenUsed="0" w:qFormat="1"/>
-    <w:lsdException w:name="Strong" w:semiHidden="0" w:uiPriority="22" w:unhideWhenUsed="0" w:qFormat="1"/>
-    <w:lsdException w:name="Emphasis" w:semiHidden="0" w:uiPriority="20" w:unhideWhenUsed="0" w:qFormat="1"/>
-    <w:lsdException w:name="Table Web 1" w:uiPriority="0"/>
-    <w:lsdException w:name="Table Grid" w:semiHidden="0" w:uiPriority="0" w:unhideWhenUsed="0"/>
-    <w:lsdException w:name="Placeholder Text" w:unhideWhenUsed="0"/>
-    <w:lsdException w:name="No Spacing" w:semiHidden="0" w:uiPriority="1" w:unhideWhenUsed="0" w:qFormat="1"/>
-    <w:lsdException w:name="Light Shading" w:semiHidden="0" w:uiPriority="60" w:unhideWhenUsed="0"/>
-    <w:lsdException w:name="Light List" w:semiHidden="0" w:uiPriority="61" w:unhideWhenUsed="0"/>
-    <w:lsdException w:name="Light Grid" w:semiHidden="0" w:uiPriority="62" w:unhideWhenUsed="0"/>
-    <w:lsdException w:name="Medium Shading 1" w:semiHidden="0" w:uiPriority="63" w:unhideWhenUsed="0"/>
-    <w:lsdException w:name="Medium Shading 2" w:semiHidden="0" w:uiPriority="64" w:unhideWhenUsed="0"/>
-    <w:lsdException w:name="Medium List 1" w:semiHidden="0" w:uiPriority="65" w:unhideWhenUsed="0"/>
-    <w:lsdException w:name="Medium List 2" w:semiHidden="0" w:uiPriority="66" w:unhideWhenUsed="0"/>
-    <w:lsdException w:name="Medium Grid 1" w:semiHidden="0" w:uiPriority="67" w:unhideWhenUsed="0"/>
-    <w:lsdException w:name="Medium Grid 2" w:semiHidden="0" w:uiPriority="68" w:unhideWhenUsed="0"/>
-    <w:lsdException w:name="Medium Grid 3" w:semiHidden="0" w:uiPriority="69" w:unhideWhenUsed="0"/>
-    <w:lsdException w:name="Dark List" w:semiHidden="0" w:uiPriority="70" w:unhideWhenUsed="0"/>
-    <w:lsdException w:name="Colorful Shading" w:semiHidden="0" w:uiPriority="71" w:unhideWhenUsed="0"/>
-    <w:lsdException w:name="Colorful List" w:semiHidden="0" w:uiPriority="72" w:unhideWhenUsed="0"/>
-    <w:lsdException w:name="Colorful Grid" w:semiHidden="0" w:uiPriority="73" w:unhideWhenUsed="0"/>
-    <w:lsdException w:name="Light Shading Accent 1" w:semiHidden="0" w:uiPriority="60" w:unhideWhenUsed="0"/>
-    <w:lsdException w:name="Light List Accent 1" w:semiHidden="0" w:uiPriority="61" w:unhideWhenUsed="0"/>
-    <w:lsdException w:name="Light Grid Accent 1" w:semiHidden="0" w:uiPriority="62" w:unhideWhenUsed="0"/>
-    <w:lsdException w:name="Medium Shading 1 Accent 1" w:semiHidden="0" w:uiPriority="63" w:unhideWhenUsed="0"/>
-    <w:lsdException w:name="Medium Shading 2 Accent 1" w:semiHidden="0" w:uiPriority="64" w:unhideWhenUsed="0"/>
-    <w:lsdException w:name="Medium List 1 Accent 1" w:semiHidden="0" w:uiPriority="65" w:unhideWhenUsed="0"/>
-    <w:lsdException w:name="Revision" w:unhideWhenUsed="0"/>
-    <w:lsdException w:name="List Paragraph" w:semiHidden="0" w:uiPriority="34" w:unhideWhenUsed="0" w:qFormat="1"/>
-    <w:lsdException w:name="Quote" w:semiHidden="0" w:uiPriority="29" w:unhideWhenUsed="0" w:qFormat="1"/>
-    <w:lsdException w:name="Intense Quote" w:semiHidden="0" w:uiPriority="30" w:unhideWhenUsed="0" w:qFormat="1"/>
-    <w:lsdException w:name="Medium List 2 Accent 1" w:semiHidden="0" w:uiPriority="66" w:unhideWhenUsed="0"/>
-    <w:lsdException w:name="Medium Grid 1 Accent 1" w:semiHidden="0" w:uiPriority="67" w:unhideWhenUsed="0"/>
-    <w:lsdException w:name="Medium Grid 2 Accent 1" w:semiHidden="0" w:uiPriority="68" w:unhideWhenUsed="0"/>
-    <w:lsdException w:name="Medium Grid 3 Accent 1" w:semiHidden="0" w:uiPriority="69" w:unhideWhenUsed="0"/>
-    <w:lsdException w:name="Dark List Accent 1" w:semiHidden="0" w:uiPriority="70" w:unhideWhenUsed="0"/>
-    <w:lsdException w:name="Colorful Shading Accent 1" w:semiHidden="0" w:uiPriority="71" w:unhideWhenUsed="0"/>
-    <w:lsdException w:name="Colorful List Accent 1" w:semiHidden="0" w:uiPriority="72" w:unhideWhenUsed="0"/>
-    <w:lsdException w:name="Colorful Grid Accent 1" w:semiHidden="0" w:uiPriority="73" w:unhideWhenUsed="0"/>
-    <w:lsdException w:name="Light Shading Accent 2" w:semiHidden="0" w:uiPriority="60" w:unhideWhenUsed="0"/>
-    <w:lsdException w:name="Light List Accent 2" w:semiHidden="0" w:uiPriority="61" w:unhideWhenUsed="0"/>
-    <w:lsdException w:name="Light Grid Accent 2" w:semiHidden="0" w:uiPriority="62" w:unhideWhenUsed="0"/>
-    <w:lsdException w:name="Medium Shading 1 Accent 2" w:semiHidden="0" w:uiPriority="63" w:unhideWhenUsed="0"/>
-    <w:lsdException w:name="Medium Shading 2 Accent 2" w:semiHidden="0" w:uiPriority="64" w:unhideWhenUsed="0"/>
-    <w:lsdException w:name="Medium List 1 Accent 2" w:semiHidden="0" w:uiPriority="65" w:unhideWhenUsed="0"/>
-    <w:lsdException w:name="Medium List 2 Accent 2" w:semiHidden="0" w:uiPriority="66" w:unhideWhenUsed="0"/>
-    <w:lsdException w:name="Medium Grid 1 Accent 2" w:semiHidden="0" w:uiPriority="67" w:unhideWhenUsed="0"/>
-    <w:lsdException w:name="Medium Grid 2 Accent 2" w:semiHidden="0" w:uiPriority="68" w:unhideWhenUsed="0"/>
-    <w:lsdException w:name="Medium Grid 3 Accent 2" w:semiHidden="0" w:uiPriority="69" w:unhideWhenUsed="0"/>
-    <w:lsdException w:name="Dark List Accent 2" w:semiHidden="0" w:uiPriority="70" w:unhideWhenUsed="0"/>
-    <w:lsdException w:name="Colorful Shading Accent 2" w:semiHidden="0" w:uiPriority="71" w:unhideWhenUsed="0"/>
-    <w:lsdException w:name="Colorful List Accent 2" w:semiHidden="0" w:uiPriority="72" w:unhideWhenUsed="0"/>
-    <w:lsdException w:name="Colorful Grid Accent 2" w:semiHidden="0" w:uiPriority="73" w:unhideWhenUsed="0"/>
-    <w:lsdException w:name="Light Shading Accent 3" w:semiHidden="0" w:uiPriority="60" w:unhideWhenUsed="0"/>
-    <w:lsdException w:name="Light List Accent 3" w:semiHidden="0" w:uiPriority="61" w:unhideWhenUsed="0"/>
-    <w:lsdException w:name="Light Grid Accent 3" w:semiHidden="0" w:uiPriority="62" w:unhideWhenUsed="0"/>
-    <w:lsdException w:name="Medium Shading 1 Accent 3" w:semiHidden="0" w:uiPriority="63" w:unhideWhenUsed="0"/>
-    <w:lsdException w:name="Medium Shading 2 Accent 3" w:semiHidden="0" w:uiPriority="64" w:unhideWhenUsed="0"/>
-    <w:lsdException w:name="Medium List 1 Accent 3" w:semiHidden="0" w:uiPriority="65" w:unhideWhenUsed="0"/>
-    <w:lsdException w:name="Medium List 2 Accent 3" w:semiHidden="0" w:uiPriority="66" w:unhideWhenUsed="0"/>
-    <w:lsdException w:name="Medium Grid 1 Accent 3" w:semiHidden="0" w:uiPriority="67" w:unhideWhenUsed="0"/>
-    <w:lsdException w:name="Medium Grid 2 Accent 3" w:semiHidden="0" w:uiPriority="68" w:unhideWhenUsed="0"/>
-    <w:lsdException w:name="Medium Grid 3 Accent 3" w:semiHidden="0" w:uiPriority="69" w:unhideWhenUsed="0"/>
-    <w:lsdException w:name="Dark List Accent 3" w:semiHidden="0" w:uiPriority="70" w:unhideWhenUsed="0"/>
-    <w:lsdException w:name="Colorful Shading Accent 3" w:semiHidden="0" w:uiPriority="71" w:unhideWhenUsed="0"/>
-    <w:lsdException w:name="Colorful List Accent 3" w:semiHidden="0" w:uiPriority="72" w:unhideWhenUsed="0"/>
-    <w:lsdException w:name="Colorful Grid Accent 3" w:semiHidden="0" w:uiPriority="73" w:unhideWhenUsed="0"/>
-    <w:lsdException w:name="Light Shading Accent 4" w:semiHidden="0" w:uiPriority="60" w:unhideWhenUsed="0"/>
-    <w:lsdException w:name="Light List Accent 4" w:semiHidden="0" w:uiPriority="61" w:unhideWhenUsed="0"/>
-    <w:lsdException w:name="Light Grid Accent 4" w:semiHidden="0" w:uiPriority="62" w:unhideWhenUsed="0"/>
-    <w:lsdException w:name="Medium Shading 1 Accent 4" w:semiHidden="0" w:uiPriority="63" w:unhideWhenUsed="0"/>
-    <w:lsdException w:name="Medium Shading 2 Accent 4" w:semiHidden="0" w:uiPriority="64" w:unhideWhenUsed="0"/>
-    <w:lsdException w:name="Medium List 1 Accent 4" w:semiHidden="0" w:uiPriority="65" w:unhideWhenUsed="0"/>
-    <w:lsdException w:name="Medium List 2 Accent 4" w:semiHidden="0" w:uiPriority="66" w:unhideWhenUsed="0"/>
-    <w:lsdException w:name="Medium Grid 1 Accent 4" w:semiHidden="0" w:uiPriority="67" w:unhideWhenUsed="0"/>
-    <w:lsdException w:name="Medium Grid 2 Accent 4" w:semiHidden="0" w:uiPriority="68" w:unhideWhenUsed="0"/>
-    <w:lsdException w:name="Medium Grid 3 Accent 4" w:semiHidden="0" w:uiPriority="69" w:unhideWhenUsed="0"/>
-    <w:lsdException w:name="Dark List Accent 4" w:semiHidden="0" w:uiPriority="70" w:unhideWhenUsed="0"/>
-    <w:lsdException w:name="Colorful Shading Accent 4" w:semiHidden="0" w:uiPriority="71" w:unhideWhenUsed="0"/>
-    <w:lsdException w:name="Colorful List Accent 4" w:semiHidden="0" w:uiPriority="72" w:unhideWhenUsed="0"/>
-    <w:lsdException w:name="Colorful Grid Accent 4" w:semiHidden="0" w:uiPriority="73" w:unhideWhenUsed="0"/>
-    <w:lsdException w:name="Light Shading Accent 5" w:semiHidden="0" w:uiPriority="60" w:unhideWhenUsed="0"/>
-    <w:lsdException w:name="Light List Accent 5" w:semiHidden="0" w:uiPriority="61" w:unhideWhenUsed="0"/>
-    <w:lsdException w:name="Light Grid Accent 5" w:semiHidden="0" w:uiPriority="62" w:unhideWhenUsed="0"/>
-    <w:lsdException w:name="Medium Shading 1 Accent 5" w:semiHidden="0" w:uiPriority="63" w:unhideWhenUsed="0"/>
-    <w:lsdException w:name="Medium Shading 2 Accent 5" w:semiHidden="0" w:uiPriority="64" w:unhideWhenUsed="0"/>
-    <w:lsdException w:name="Medium List 1 Accent 5" w:semiHidden="0" w:uiPriority="65" w:unhideWhenUsed="0"/>
-    <w:lsdException w:name="Medium List 2 Accent 5" w:semiHidden="0" w:uiPriority="66" w:unhideWhenUsed="0"/>
-    <w:lsdException w:name="Medium Grid 1 Accent 5" w:semiHidden="0" w:uiPriority="67" w:unhideWhenUsed="0"/>
-    <w:lsdException w:name="Medium Grid 2 Accent 5" w:semiHidden="0" w:uiPriority="68" w:unhideWhenUsed="0"/>
-    <w:lsdException w:name="Medium Grid 3 Accent 5" w:semiHidden="0" w:uiPriority="69" w:unhideWhenUsed="0"/>
-    <w:lsdException w:name="Dark List Accent 5" w:semiHidden="0" w:uiPriority="70" w:unhideWhenUsed="0"/>
-    <w:lsdException w:name="Colorful Shading Accent 5" w:semiHidden="0" w:uiPriority="71" w:unhideWhenUsed="0"/>
-    <w:lsdException w:name="Colorful List Accent 5" w:semiHidden="0" w:uiPriority="72" w:unhideWhenUsed="0"/>
-    <w:lsdException w:name="Colorful Grid Accent 5" w:semiHidden="0" w:uiPriority="73" w:unhideWhenUsed="0"/>
-    <w:lsdException w:name="Light Shading Accent 6" w:semiHidden="0" w:uiPriority="60" w:unhideWhenUsed="0"/>
-    <w:lsdException w:name="Light List Accent 6" w:semiHidden="0" w:uiPriority="61" w:unhideWhenUsed="0"/>
-    <w:lsdException w:name="Light Grid Accent 6" w:semiHidden="0" w:uiPriority="62" w:unhideWhenUsed="0"/>
-    <w:lsdException w:name="Medium Shading 1 Accent 6" w:semiHidden="0" w:uiPriority="63" w:unhideWhenUsed="0"/>
-    <w:lsdException w:name="Medium Shading 2 Accent 6" w:semiHidden="0" w:uiPriority="64" w:unhideWhenUsed="0"/>
-    <w:lsdException w:name="Medium List 1 Accent 6" w:semiHidden="0" w:uiPriority="65" w:unhideWhenUsed="0"/>
-    <w:lsdException w:name="Medium List 2 Accent 6" w:semiHidden="0" w:uiPriority="66" w:unhideWhenUsed="0"/>
-    <w:lsdException w:name="Medium Grid 1 Accent 6" w:semiHidden="0" w:uiPriority="67" w:unhideWhenUsed="0"/>
-    <w:lsdException w:name="Medium Grid 2 Accent 6" w:semiHidden="0" w:uiPriority="68" w:unhideWhenUsed="0"/>
-    <w:lsdException w:name="Medium Grid 3 Accent 6" w:semiHidden="0" w:uiPriority="69" w:unhideWhenUsed="0"/>
-    <w:lsdException w:name="Dark List Accent 6" w:semiHidden="0" w:uiPriority="70" w:unhideWhenUsed="0"/>
-    <w:lsdException w:name="Colorful Shading Accent 6" w:semiHidden="0" w:uiPriority="71" w:unhideWhenUsed="0"/>
-    <w:lsdException w:name="Colorful List Accent 6" w:semiHidden="0" w:uiPriority="72" w:unhideWhenUsed="0"/>
-    <w:lsdException w:name="Colorful Grid Accent 6" w:semiHidden="0" w:uiPriority="73" w:unhideWhenUsed="0"/>
-    <w:lsdException w:name="Subtle Emphasis" w:semiHidden="0" w:uiPriority="19" w:unhideWhenUsed="0" w:qFormat="1"/>
-    <w:lsdException w:name="Intense Emphasis" w:semiHidden="0" w:uiPriority="21" w:unhideWhenUsed="0" w:qFormat="1"/>
-    <w:lsdException w:name="Subtle Reference" w:semiHidden="0" w:uiPriority="31" w:unhideWhenUsed="0" w:qFormat="1"/>
-    <w:lsdException w:name="Intense Reference" w:semiHidden="0" w:uiPriority="32" w:unhideWhenUsed="0" w:qFormat="1"/>
-    <w:lsdException w:name="Book Title" w:semiHidden="0" w:uiPriority="33" w:unhideWhenUsed="0" w:qFormat="1"/>
-    <w:lsdException w:name="Bibliography" w:uiPriority="37"/>
-    <w:lsdException w:name="TOC Heading" w:uiPriority="39" w:qFormat="1"/>
-  </w:latentStyles>
-  <w:style w:type="paragraph" w:default="1" w:styleId="Normal">
-    <w:name w:val="Normal"/>
-    <w:qFormat/>
-    <w:rsid w:val="0072424B"/>
-    <w:pPr>
-      <w:suppressAutoHyphens/>
-      <w:spacing w:after="0" w:line="240" w:lineRule="auto"/>
-    </w:pPr>
-    <w:rPr>
-      <w:rFonts w:ascii="Times New Roman" w:eastAsia="Times New Roman" w:hAnsi="Times New Roman" w:cs="Times New Roman"/>
-      <w:sz w:val="20"/>
-      <w:szCs w:val="20"/>
-      <w:lang w:val="en-AU" w:eastAsia="ar-SA"/>
-    </w:rPr>
-  </w:style>
-  <w:style w:type="paragraph" w:styleId="Heading2">
-    <w:name w:val="heading 2"/>
-    <w:basedOn w:val="Normal"/>
-    <w:next w:val="Normal"/>
-    <w:link w:val="Heading2Char"/>
-    <w:qFormat/>
-    <w:rsid w:val="0072424B"/>
-    <w:pPr>
-      <w:keepNext/>
-      <w:jc w:val="center"/>
-      <w:outlineLvl w:val="1"/>
-    </w:pPr>
-    <w:rPr>
-      <w:b/>
-      <w:lang w:val="bg-BG"/>
-    </w:rPr>
-  </w:style>
-  <w:style w:type="paragraph" w:styleId="Heading4">
-    <w:name w:val="heading 4"/>
-    <w:basedOn w:val="Normal"/>
-    <w:next w:val="Normal"/>
-    <w:link w:val="Heading4Char"/>
-    <w:qFormat/>
-    <w:rsid w:val="0072424B"/>
-    <w:pPr>
-      <w:keepNext/>
-      <w:jc w:val="center"/>
-      <w:outlineLvl w:val="3"/>
-    </w:pPr>
-    <w:rPr>
-      <w:rFonts w:ascii="Arial" w:hAnsi="Arial"/>
-      <w:i/>
-      <w:lang w:val="bg-BG"/>
-    </w:rPr>
-  </w:style>
-  <w:style w:type="paragraph" w:styleId="Heading7">
-    <w:name w:val="heading 7"/>
-    <w:basedOn w:val="Normal"/>
-    <w:next w:val="Normal"/>
-    <w:link w:val="Heading7Char"/>
-    <w:unhideWhenUsed/>
-    <w:qFormat/>
-    <w:rsid w:val="00A46381"/>
-    <w:pPr>
-      <w:keepNext/>
-      <w:keepLines/>
-      <w:spacing w:before="200"/>
-      <w:outlineLvl w:val="6"/>
-    </w:pPr>
-    <w:rPr>
-      <w:rFonts w:asciiTheme="majorHAnsi" w:eastAsiaTheme="majorEastAsia" w:hAnsiTheme="majorHAnsi" w:cstheme="majorBidi"/>
-      <w:i/>
-      <w:iCs/>
-      <w:color w:val="404040" w:themeColor="text1" w:themeTint="BF"/>
-    </w:rPr>
-  </w:style>
-  <w:style w:type="character" w:default="1" w:styleId="DefaultParagraphFont">
-    <w:name w:val="Default Paragraph Font"/>
-    <w:uiPriority w:val="1"/>
-    <w:semiHidden/>
-    <w:unhideWhenUsed/>
-  </w:style>
-  <w:style w:type="table" w:default="1" w:styleId="TableNormal">
-    <w:name w:val="Normal Table"/>
-    <w:uiPriority w:val="99"/>
-    <w:semiHidden/>
-    <w:unhideWhenUsed/>
-    <w:tblPr>
-      <w:tblInd w:w="0" w:type="dxa"/>
-      <w:tblCellMar>
-        <w:top w:w="0" w:type="dxa"/>
-        <w:left w:w="108" w:type="dxa"/>
-        <w:bottom w:w="0" w:type="dxa"/>
-        <w:right w:w="108" w:type="dxa"/>
-      </w:tblCellMar>
-    </w:tblPr>
-  </w:style>
-  <w:style w:type="numbering" w:default="1" w:styleId="NoList">
-    <w:name w:val="No List"/>
-    <w:uiPriority w:val="99"/>
-    <w:semiHidden/>
-    <w:unhideWhenUsed/>
-  </w:style>
-  <w:style w:type="character" w:customStyle="1" w:styleId="Heading2Char">
-    <w:name w:val="Heading 2 Char"/>
-    <w:basedOn w:val="DefaultParagraphFont"/>
-    <w:link w:val="Heading2"/>
-    <w:rsid w:val="0072424B"/>
-    <w:rPr>
-      <w:rFonts w:ascii="Times New Roman" w:eastAsia="Times New Roman" w:hAnsi="Times New Roman" w:cs="Times New Roman"/>
-      <w:b/>
-      <w:sz w:val="20"/>
-      <w:szCs w:val="20"/>
-      <w:lang w:val="bg-BG" w:eastAsia="ar-SA"/>
-    </w:rPr>
-  </w:style>
-  <w:style w:type="character" w:customStyle="1" w:styleId="Heading4Char">
-    <w:name w:val="Heading 4 Char"/>
-    <w:basedOn w:val="DefaultParagraphFont"/>
-    <w:link w:val="Heading4"/>
-    <w:rsid w:val="0072424B"/>
-    <w:rPr>
-      <w:rFonts w:ascii="Arial" w:eastAsia="Times New Roman" w:hAnsi="Arial" w:cs="Times New Roman"/>
-      <w:i/>
-      <w:sz w:val="20"/>
-      <w:szCs w:val="20"/>
-      <w:lang w:val="bg-BG" w:eastAsia="ar-SA"/>
-    </w:rPr>
-  </w:style>
-  <w:style w:type="character" w:styleId="PageNumber">
-    <w:name w:val="page number"/>
-    <w:basedOn w:val="DefaultParagraphFont"/>
-    <w:rsid w:val="0072424B"/>
-  </w:style>
-  <w:style w:type="paragraph" w:styleId="BodyText">
-    <w:name w:val="Body Text"/>
-    <w:basedOn w:val="Normal"/>
-    <w:link w:val="BodyTextChar"/>
-    <w:rsid w:val="0072424B"/>
-    <w:pPr>
-      <w:jc w:val="both"/>
-    </w:pPr>
-    <w:rPr>
-      <w:sz w:val="28"/>
-      <w:lang w:val="bg-BG"/>
-    </w:rPr>
-  </w:style>
-  <w:style w:type="character" w:customStyle="1" w:styleId="BodyTextChar">
-    <w:name w:val="Body Text Char"/>
-    <w:basedOn w:val="DefaultParagraphFont"/>
-    <w:link w:val="BodyText"/>
-    <w:rsid w:val="0072424B"/>
-    <w:rPr>
-      <w:rFonts w:ascii="Times New Roman" w:eastAsia="Times New Roman" w:hAnsi="Times New Roman" w:cs="Times New Roman"/>
-      <w:sz w:val="28"/>
-      <w:szCs w:val="20"/>
-      <w:lang w:val="bg-BG" w:eastAsia="ar-SA"/>
-    </w:rPr>
-  </w:style>
-  <w:style w:type="paragraph" w:styleId="List">
-    <w:name w:val="List"/>
-    <w:basedOn w:val="BodyText"/>
-    <w:rsid w:val="0072424B"/>
-    <w:rPr>
-      <w:rFonts w:cs="Lucidasans"/>
-    </w:rPr>
-  </w:style>
-  <w:style w:type="paragraph" w:styleId="Header">
-    <w:name w:val="header"/>
-    <w:basedOn w:val="Normal"/>
-    <w:link w:val="HeaderChar"/>
-    <w:rsid w:val="0072424B"/>
-    <w:pPr>
-      <w:tabs>
-        <w:tab w:val="center" w:pos="4153"/>
-        <w:tab w:val="right" w:pos="8306"/>
-      </w:tabs>
-    </w:pPr>
-  </w:style>
-  <w:style w:type="character" w:customStyle="1" w:styleId="HeaderChar">
-    <w:name w:val="Header Char"/>
-    <w:basedOn w:val="DefaultParagraphFont"/>
-    <w:link w:val="Header"/>
-    <w:rsid w:val="0072424B"/>
-    <w:rPr>
-      <w:rFonts w:ascii="Times New Roman" w:eastAsia="Times New Roman" w:hAnsi="Times New Roman" w:cs="Times New Roman"/>
-      <w:sz w:val="20"/>
-      <w:szCs w:val="20"/>
-      <w:lang w:val="en-AU" w:eastAsia="ar-SA"/>
-    </w:rPr>
-  </w:style>
-  <w:style w:type="paragraph" w:styleId="Footer">
-    <w:name w:val="footer"/>
-    <w:basedOn w:val="Normal"/>
-    <w:link w:val="FooterChar"/>
-    <w:rsid w:val="0072424B"/>
-    <w:pPr>
-      <w:tabs>
-        <w:tab w:val="center" w:pos="4153"/>
-        <w:tab w:val="right" w:pos="8306"/>
-      </w:tabs>
-    </w:pPr>
-  </w:style>
-  <w:style w:type="character" w:customStyle="1" w:styleId="FooterChar">
-    <w:name w:val="Footer Char"/>
-    <w:basedOn w:val="DefaultParagraphFont"/>
-    <w:link w:val="Footer"/>
-    <w:rsid w:val="0072424B"/>
-    <w:rPr>
-      <w:rFonts w:ascii="Times New Roman" w:eastAsia="Times New Roman" w:hAnsi="Times New Roman" w:cs="Times New Roman"/>
-      <w:sz w:val="20"/>
-      <w:szCs w:val="20"/>
-      <w:lang w:val="en-AU" w:eastAsia="ar-SA"/>
-    </w:rPr>
-  </w:style>
-  <w:style w:type="paragraph" w:styleId="Title">
-    <w:name w:val="Title"/>
-    <w:basedOn w:val="Normal"/>
-    <w:next w:val="Subtitle"/>
-    <w:link w:val="TitleChar"/>
-    <w:qFormat/>
-    <w:rsid w:val="0072424B"/>
-    <w:pPr>
-      <w:jc w:val="center"/>
-    </w:pPr>
-    <w:rPr>
-      <w:b/>
-      <w:bCs/>
-      <w:sz w:val="24"/>
-      <w:lang w:val="bg-BG"/>
-    </w:rPr>
-  </w:style>
-  <w:style w:type="character" w:customStyle="1" w:styleId="TitleChar">
-    <w:name w:val="Title Char"/>
-    <w:basedOn w:val="DefaultParagraphFont"/>
-    <w:link w:val="Title"/>
-    <w:rsid w:val="0072424B"/>
-    <w:rPr>
-      <w:rFonts w:ascii="Times New Roman" w:eastAsia="Times New Roman" w:hAnsi="Times New Roman" w:cs="Times New Roman"/>
-      <w:b/>
-      <w:bCs/>
-      <w:sz w:val="24"/>
-      <w:szCs w:val="20"/>
-      <w:lang w:val="bg-BG" w:eastAsia="ar-SA"/>
-    </w:rPr>
-  </w:style>
-  <w:style w:type="paragraph" w:styleId="Subtitle">
-    <w:name w:val="Subtitle"/>
-    <w:basedOn w:val="Normal"/>
-    <w:next w:val="BodyText"/>
-    <w:link w:val="SubtitleChar"/>
-    <w:qFormat/>
-    <w:rsid w:val="0072424B"/>
-    <w:pPr>
-      <w:spacing w:after="60"/>
-      <w:jc w:val="center"/>
-    </w:pPr>
-    <w:rPr>
-      <w:rFonts w:ascii="Arial" w:hAnsi="Arial" w:cs="Arial"/>
-      <w:sz w:val="24"/>
-      <w:szCs w:val="24"/>
-    </w:rPr>
-  </w:style>
-  <w:style w:type="character" w:customStyle="1" w:styleId="SubtitleChar">
-    <w:name w:val="Subtitle Char"/>
-    <w:basedOn w:val="DefaultParagraphFont"/>
-    <w:link w:val="Subtitle"/>
-    <w:rsid w:val="0072424B"/>
-    <w:rPr>
-      <w:rFonts w:ascii="Arial" w:eastAsia="Times New Roman" w:hAnsi="Arial" w:cs="Arial"/>
-      <w:sz w:val="24"/>
-      <w:szCs w:val="24"/>
-      <w:lang w:val="en-AU" w:eastAsia="ar-SA"/>
-    </w:rPr>
-  </w:style>
-  <w:style w:type="table" w:styleId="TableGrid">
-    <w:name w:val="Table Grid"/>
-    <w:basedOn w:val="TableNormal"/>
-    <w:rsid w:val="00C4009E"/>
-    <w:pPr>
-      <w:spacing w:after="0" w:line="240" w:lineRule="auto"/>
-    </w:pPr>
-    <w:tblPr>
-      <w:tblInd w:w="0" w:type="dxa"/>
-      <w:tblBorders>
-        <w:top w:val="single" w:sz="4" w:space="0" w:color="auto"/>
-        <w:left w:val="single" w:sz="4" w:space="0" w:color="auto"/>
-        <w:bottom w:val="single" w:sz="4" w:space="0" w:color="auto"/>
-        <w:right w:val="single" w:sz="4" w:space="0" w:color="auto"/>
-        <w:insideH w:val="single" w:sz="4" w:space="0" w:color="auto"/>
-        <w:insideV w:val="single" w:sz="4" w:space="0" w:color="auto"/>
-      </w:tblBorders>
-      <w:tblCellMar>
-        <w:top w:w="0" w:type="dxa"/>
-        <w:left w:w="108" w:type="dxa"/>
-        <w:bottom w:w="0" w:type="dxa"/>
-        <w:right w:w="108" w:type="dxa"/>
-      </w:tblCellMar>
-    </w:tblPr>
-  </w:style>
-  <w:style w:type="character" w:customStyle="1" w:styleId="Heading7Char">
-    <w:name w:val="Heading 7 Char"/>
-    <w:basedOn w:val="DefaultParagraphFont"/>
-    <w:link w:val="Heading7"/>
-    <w:uiPriority w:val="9"/>
-    <w:semiHidden/>
-    <w:rsid w:val="00A46381"/>
-    <w:rPr>
-      <w:rFonts w:asciiTheme="majorHAnsi" w:eastAsiaTheme="majorEastAsia" w:hAnsiTheme="majorHAnsi" w:cstheme="majorBidi"/>
-      <w:i/>
-      <w:iCs/>
-      <w:color w:val="404040" w:themeColor="text1" w:themeTint="BF"/>
-      <w:sz w:val="20"/>
-      <w:szCs w:val="20"/>
-      <w:lang w:val="en-AU" w:eastAsia="ar-SA"/>
-    </w:rPr>
-  </w:style>
-  <w:style w:type="table" w:styleId="TableWeb1">
-    <w:name w:val="Table Web 1"/>
-    <w:basedOn w:val="TableNormal"/>
-    <w:rsid w:val="00A46381"/>
-    <w:pPr>
-      <w:suppressAutoHyphens/>
-      <w:spacing w:after="0" w:line="240" w:lineRule="auto"/>
-    </w:pPr>
-    <w:rPr>
-      <w:rFonts w:ascii="Times New Roman" w:eastAsia="Times New Roman" w:hAnsi="Times New Roman" w:cs="Times New Roman"/>
-      <w:sz w:val="20"/>
-      <w:szCs w:val="20"/>
-      <w:lang w:val="bg-BG" w:eastAsia="bg-BG"/>
-    </w:rPr>
-    <w:tblPr>
-      <w:tblCellSpacing w:w="20" w:type="dxa"/>
-      <w:tblInd w:w="0" w:type="dxa"/>
-      <w:tblBorders>
-        <w:top w:val="outset" w:sz="6" w:space="0" w:color="auto"/>
-        <w:left w:val="outset" w:sz="6" w:space="0" w:color="auto"/>
-        <w:bottom w:val="outset" w:sz="6" w:space="0" w:color="auto"/>
-        <w:right w:val="outset" w:sz="6" w:space="0" w:color="auto"/>
-        <w:insideH w:val="outset" w:sz="6" w:space="0" w:color="auto"/>
-        <w:insideV w:val="outset" w:sz="6" w:space="0" w:color="auto"/>
-      </w:tblBorders>
-      <w:tblCellMar>
-        <w:top w:w="0" w:type="dxa"/>
-        <w:left w:w="108" w:type="dxa"/>
-        <w:bottom w:w="0" w:type="dxa"/>
-        <w:right w:w="108" w:type="dxa"/>
-      </w:tblCellMar>
-    </w:tblPr>
-    <w:trPr>
-      <w:tblCellSpacing w:w="20" w:type="dxa"/>
-    </w:trPr>
-    <w:tcPr>
-      <w:shd w:val="clear" w:color="auto" w:fill="auto"/>
-    </w:tcPr>
     <w:tblStylePr w:type="firstRow">
       <w:rPr>
         <w:color w:val="auto"/>

</xml_diff>